<commit_message>
Bizonylat API dokumentáció javítás
</commit_message>
<xml_diff>
--- a/docs/spec/M2M új bizonylat interfész specifikáció 1.0.docx
+++ b/docs/spec/M2M új bizonylat interfész specifikáció 1.0.docx
@@ -303,7 +303,7 @@
       <w:sdtContent>
         <w:p>
           <w:pPr>
-            <w:pStyle w:val="TJ1"/>
+            <w:pStyle w:val="TOC1"/>
             <w:tabs>
               <w:tab w:val="left" w:pos="464"/>
               <w:tab w:val="right" w:leader="dot" w:pos="9065"/>
@@ -331,7 +331,7 @@
           <w:hyperlink w:anchor="_Toc234087531" w:history="1">
             <w:r>
               <w:rPr>
-                <w:rStyle w:val="Hiperhivatkozs"/>
+                <w:rStyle w:val="Hyperlink"/>
                 <w:noProof/>
               </w:rPr>
               <w:t>1.</w:t>
@@ -351,7 +351,7 @@
             </w:r>
             <w:r>
               <w:rPr>
-                <w:rStyle w:val="Hiperhivatkozs"/>
+                <w:rStyle w:val="Hyperlink"/>
                 <w:noProof/>
               </w:rPr>
               <w:t>Bevezetés</w:t>
@@ -408,7 +408,7 @@
         </w:p>
         <w:p>
           <w:pPr>
-            <w:pStyle w:val="TJ1"/>
+            <w:pStyle w:val="TOC1"/>
             <w:tabs>
               <w:tab w:val="left" w:pos="464"/>
               <w:tab w:val="right" w:leader="dot" w:pos="9065"/>
@@ -427,7 +427,7 @@
           <w:hyperlink w:anchor="_Toc234087532" w:history="1">
             <w:r>
               <w:rPr>
-                <w:rStyle w:val="Hiperhivatkozs"/>
+                <w:rStyle w:val="Hyperlink"/>
                 <w:noProof/>
               </w:rPr>
               <w:t>2.</w:t>
@@ -447,7 +447,7 @@
             </w:r>
             <w:r>
               <w:rPr>
-                <w:rStyle w:val="Hiperhivatkozs"/>
+                <w:rStyle w:val="Hyperlink"/>
                 <w:noProof/>
               </w:rPr>
               <w:t>Használati feltételek</w:t>
@@ -504,7 +504,7 @@
         </w:p>
         <w:p>
           <w:pPr>
-            <w:pStyle w:val="TJ1"/>
+            <w:pStyle w:val="TOC1"/>
             <w:tabs>
               <w:tab w:val="left" w:pos="464"/>
               <w:tab w:val="right" w:leader="dot" w:pos="9065"/>
@@ -523,7 +523,7 @@
           <w:hyperlink w:anchor="_Toc234087533" w:history="1">
             <w:r>
               <w:rPr>
-                <w:rStyle w:val="Hiperhivatkozs"/>
+                <w:rStyle w:val="Hyperlink"/>
                 <w:noProof/>
               </w:rPr>
               <w:t>3.</w:t>
@@ -543,7 +543,7 @@
             </w:r>
             <w:r>
               <w:rPr>
-                <w:rStyle w:val="Hiperhivatkozs"/>
+                <w:rStyle w:val="Hyperlink"/>
                 <w:noProof/>
               </w:rPr>
               <w:t>Technikai követelmények</w:t>
@@ -600,7 +600,7 @@
         </w:p>
         <w:p>
           <w:pPr>
-            <w:pStyle w:val="TJ2"/>
+            <w:pStyle w:val="TOC2"/>
             <w:tabs>
               <w:tab w:val="left" w:pos="960"/>
               <w:tab w:val="right" w:leader="dot" w:pos="9065"/>
@@ -619,7 +619,7 @@
           <w:hyperlink w:anchor="_Toc234087534" w:history="1">
             <w:r>
               <w:rPr>
-                <w:rStyle w:val="Hiperhivatkozs"/>
+                <w:rStyle w:val="Hyperlink"/>
                 <w:noProof/>
               </w:rPr>
               <w:t>3.1.</w:t>
@@ -639,7 +639,7 @@
             </w:r>
             <w:r>
               <w:rPr>
-                <w:rStyle w:val="Hiperhivatkozs"/>
+                <w:rStyle w:val="Hyperlink"/>
                 <w:noProof/>
               </w:rPr>
               <w:t>Alapvető technológiák</w:t>
@@ -696,7 +696,7 @@
         </w:p>
         <w:p>
           <w:pPr>
-            <w:pStyle w:val="TJ2"/>
+            <w:pStyle w:val="TOC2"/>
             <w:tabs>
               <w:tab w:val="left" w:pos="960"/>
               <w:tab w:val="right" w:leader="dot" w:pos="9065"/>
@@ -715,7 +715,7 @@
           <w:hyperlink w:anchor="_Toc234087535" w:history="1">
             <w:r>
               <w:rPr>
-                <w:rStyle w:val="Hiperhivatkozs"/>
+                <w:rStyle w:val="Hyperlink"/>
                 <w:noProof/>
               </w:rPr>
               <w:t>3.2.</w:t>
@@ -735,7 +735,7 @@
             </w:r>
             <w:r>
               <w:rPr>
-                <w:rStyle w:val="Hiperhivatkozs"/>
+                <w:rStyle w:val="Hyperlink"/>
                 <w:noProof/>
               </w:rPr>
               <w:t>Kódolási, titkosítási algoritmusok</w:t>
@@ -792,7 +792,7 @@
         </w:p>
         <w:p>
           <w:pPr>
-            <w:pStyle w:val="TJ1"/>
+            <w:pStyle w:val="TOC1"/>
             <w:tabs>
               <w:tab w:val="left" w:pos="464"/>
               <w:tab w:val="right" w:leader="dot" w:pos="9065"/>
@@ -811,7 +811,7 @@
           <w:hyperlink w:anchor="_Toc234087536" w:history="1">
             <w:r>
               <w:rPr>
-                <w:rStyle w:val="Hiperhivatkozs"/>
+                <w:rStyle w:val="Hyperlink"/>
                 <w:noProof/>
               </w:rPr>
               <w:t>4.</w:t>
@@ -831,7 +831,7 @@
             </w:r>
             <w:r>
               <w:rPr>
-                <w:rStyle w:val="Hiperhivatkozs"/>
+                <w:rStyle w:val="Hyperlink"/>
                 <w:noProof/>
               </w:rPr>
               <w:t>Beküldött bizonylattal szembeni követelmények</w:t>
@@ -888,7 +888,7 @@
         </w:p>
         <w:p>
           <w:pPr>
-            <w:pStyle w:val="TJ1"/>
+            <w:pStyle w:val="TOC1"/>
             <w:tabs>
               <w:tab w:val="left" w:pos="464"/>
               <w:tab w:val="right" w:leader="dot" w:pos="9065"/>
@@ -907,7 +907,7 @@
           <w:hyperlink w:anchor="_Toc234087537" w:history="1">
             <w:r>
               <w:rPr>
-                <w:rStyle w:val="Hiperhivatkozs"/>
+                <w:rStyle w:val="Hyperlink"/>
                 <w:noProof/>
               </w:rPr>
               <w:t>5.</w:t>
@@ -927,7 +927,7 @@
             </w:r>
             <w:r>
               <w:rPr>
-                <w:rStyle w:val="Hiperhivatkozs"/>
+                <w:rStyle w:val="Hyperlink"/>
                 <w:noProof/>
               </w:rPr>
               <w:t>Folyamat</w:t>
@@ -984,7 +984,7 @@
         </w:p>
         <w:p>
           <w:pPr>
-            <w:pStyle w:val="TJ2"/>
+            <w:pStyle w:val="TOC2"/>
             <w:tabs>
               <w:tab w:val="left" w:pos="960"/>
               <w:tab w:val="right" w:leader="dot" w:pos="9065"/>
@@ -1003,7 +1003,7 @@
           <w:hyperlink w:anchor="_Toc234087538" w:history="1">
             <w:r>
               <w:rPr>
-                <w:rStyle w:val="Hiperhivatkozs"/>
+                <w:rStyle w:val="Hyperlink"/>
                 <w:noProof/>
               </w:rPr>
               <w:t>5.1.</w:t>
@@ -1023,7 +1023,7 @@
             </w:r>
             <w:r>
               <w:rPr>
-                <w:rStyle w:val="Hiperhivatkozs"/>
+                <w:rStyle w:val="Hyperlink"/>
                 <w:noProof/>
               </w:rPr>
               <w:t>Kalkuláció</w:t>
@@ -1080,7 +1080,7 @@
         </w:p>
         <w:p>
           <w:pPr>
-            <w:pStyle w:val="TJ2"/>
+            <w:pStyle w:val="TOC2"/>
             <w:tabs>
               <w:tab w:val="left" w:pos="960"/>
               <w:tab w:val="right" w:leader="dot" w:pos="9065"/>
@@ -1099,7 +1099,7 @@
           <w:hyperlink w:anchor="_Toc234087539" w:history="1">
             <w:r>
               <w:rPr>
-                <w:rStyle w:val="Hiperhivatkozs"/>
+                <w:rStyle w:val="Hyperlink"/>
                 <w:noProof/>
               </w:rPr>
               <w:t>5.2.</w:t>
@@ -1119,7 +1119,7 @@
             </w:r>
             <w:r>
               <w:rPr>
-                <w:rStyle w:val="Hiperhivatkozs"/>
+                <w:rStyle w:val="Hyperlink"/>
                 <w:noProof/>
               </w:rPr>
               <w:t>Validáció</w:t>
@@ -1176,7 +1176,7 @@
         </w:p>
         <w:p>
           <w:pPr>
-            <w:pStyle w:val="TJ2"/>
+            <w:pStyle w:val="TOC2"/>
             <w:tabs>
               <w:tab w:val="left" w:pos="960"/>
               <w:tab w:val="right" w:leader="dot" w:pos="9065"/>
@@ -1195,7 +1195,7 @@
           <w:hyperlink w:anchor="_Toc234087540" w:history="1">
             <w:r>
               <w:rPr>
-                <w:rStyle w:val="Hiperhivatkozs"/>
+                <w:rStyle w:val="Hyperlink"/>
                 <w:noProof/>
               </w:rPr>
               <w:t>5.3.</w:t>
@@ -1215,7 +1215,7 @@
             </w:r>
             <w:r>
               <w:rPr>
-                <w:rStyle w:val="Hiperhivatkozs"/>
+                <w:rStyle w:val="Hyperlink"/>
                 <w:noProof/>
               </w:rPr>
               <w:t>Beküldés</w:t>
@@ -1272,7 +1272,7 @@
         </w:p>
         <w:p>
           <w:pPr>
-            <w:pStyle w:val="TJ2"/>
+            <w:pStyle w:val="TOC2"/>
             <w:tabs>
               <w:tab w:val="left" w:pos="960"/>
               <w:tab w:val="right" w:leader="dot" w:pos="9065"/>
@@ -1291,7 +1291,7 @@
           <w:hyperlink w:anchor="_Toc234087541" w:history="1">
             <w:r>
               <w:rPr>
-                <w:rStyle w:val="Hiperhivatkozs"/>
+                <w:rStyle w:val="Hyperlink"/>
                 <w:noProof/>
               </w:rPr>
               <w:t>5.4.</w:t>
@@ -1311,7 +1311,7 @@
             </w:r>
             <w:r>
               <w:rPr>
-                <w:rStyle w:val="Hiperhivatkozs"/>
+                <w:rStyle w:val="Hyperlink"/>
                 <w:noProof/>
               </w:rPr>
               <w:t>Teljes folyamat az eredmények utólagos lekérdezésével</w:t>
@@ -1368,7 +1368,7 @@
         </w:p>
         <w:p>
           <w:pPr>
-            <w:pStyle w:val="TJ1"/>
+            <w:pStyle w:val="TOC1"/>
             <w:tabs>
               <w:tab w:val="left" w:pos="464"/>
               <w:tab w:val="right" w:leader="dot" w:pos="9065"/>
@@ -1387,7 +1387,7 @@
           <w:hyperlink w:anchor="_Toc234087542" w:history="1">
             <w:r>
               <w:rPr>
-                <w:rStyle w:val="Hiperhivatkozs"/>
+                <w:rStyle w:val="Hyperlink"/>
                 <w:noProof/>
               </w:rPr>
               <w:t>6.</w:t>
@@ -1407,7 +1407,7 @@
             </w:r>
             <w:r>
               <w:rPr>
-                <w:rStyle w:val="Hiperhivatkozs"/>
+                <w:rStyle w:val="Hyperlink"/>
                 <w:noProof/>
               </w:rPr>
               <w:t>Általános interfész elemek</w:t>
@@ -1464,7 +1464,7 @@
         </w:p>
         <w:p>
           <w:pPr>
-            <w:pStyle w:val="TJ2"/>
+            <w:pStyle w:val="TOC2"/>
             <w:tabs>
               <w:tab w:val="left" w:pos="960"/>
               <w:tab w:val="right" w:leader="dot" w:pos="9065"/>
@@ -1483,7 +1483,7 @@
           <w:hyperlink w:anchor="_Toc234087543" w:history="1">
             <w:r>
               <w:rPr>
-                <w:rStyle w:val="Hiperhivatkozs"/>
+                <w:rStyle w:val="Hyperlink"/>
                 <w:noProof/>
               </w:rPr>
               <w:t>6.1.</w:t>
@@ -1503,7 +1503,7 @@
             </w:r>
             <w:r>
               <w:rPr>
-                <w:rStyle w:val="Hiperhivatkozs"/>
+                <w:rStyle w:val="Hyperlink"/>
                 <w:noProof/>
               </w:rPr>
               <w:t>Általános formátumok</w:t>
@@ -1560,7 +1560,7 @@
         </w:p>
         <w:p>
           <w:pPr>
-            <w:pStyle w:val="TJ2"/>
+            <w:pStyle w:val="TOC2"/>
             <w:tabs>
               <w:tab w:val="left" w:pos="960"/>
               <w:tab w:val="right" w:leader="dot" w:pos="9065"/>
@@ -1579,7 +1579,7 @@
           <w:hyperlink w:anchor="_Toc234087544" w:history="1">
             <w:r>
               <w:rPr>
-                <w:rStyle w:val="Hiperhivatkozs"/>
+                <w:rStyle w:val="Hyperlink"/>
                 <w:noProof/>
               </w:rPr>
               <w:t>6.2.</w:t>
@@ -1599,7 +1599,7 @@
             </w:r>
             <w:r>
               <w:rPr>
-                <w:rStyle w:val="Hiperhivatkozs"/>
+                <w:rStyle w:val="Hyperlink"/>
                 <w:noProof/>
               </w:rPr>
               <w:t>Általános technikai adatok</w:t>
@@ -1656,7 +1656,7 @@
         </w:p>
         <w:p>
           <w:pPr>
-            <w:pStyle w:val="TJ2"/>
+            <w:pStyle w:val="TOC2"/>
             <w:tabs>
               <w:tab w:val="left" w:pos="960"/>
               <w:tab w:val="right" w:leader="dot" w:pos="9065"/>
@@ -1675,7 +1675,7 @@
           <w:hyperlink w:anchor="_Toc234087545" w:history="1">
             <w:r>
               <w:rPr>
-                <w:rStyle w:val="Hiperhivatkozs"/>
+                <w:rStyle w:val="Hyperlink"/>
                 <w:i/>
                 <w:iCs/>
                 <w:noProof/>
@@ -1697,7 +1697,7 @@
             </w:r>
             <w:r>
               <w:rPr>
-                <w:rStyle w:val="Hiperhivatkozs"/>
+                <w:rStyle w:val="Hyperlink"/>
                 <w:i/>
                 <w:iCs/>
                 <w:noProof/>
@@ -1756,7 +1756,7 @@
         </w:p>
         <w:p>
           <w:pPr>
-            <w:pStyle w:val="TJ1"/>
+            <w:pStyle w:val="TOC1"/>
             <w:tabs>
               <w:tab w:val="left" w:pos="464"/>
               <w:tab w:val="right" w:leader="dot" w:pos="9065"/>
@@ -1775,7 +1775,7 @@
           <w:hyperlink w:anchor="_Toc234087546" w:history="1">
             <w:r>
               <w:rPr>
-                <w:rStyle w:val="Hiperhivatkozs"/>
+                <w:rStyle w:val="Hyperlink"/>
                 <w:noProof/>
               </w:rPr>
               <w:t>7.</w:t>
@@ -1795,7 +1795,7 @@
             </w:r>
             <w:r>
               <w:rPr>
-                <w:rStyle w:val="Hiperhivatkozs"/>
+                <w:rStyle w:val="Hyperlink"/>
                 <w:noProof/>
               </w:rPr>
               <w:t>REST interfész</w:t>
@@ -1852,7 +1852,7 @@
         </w:p>
         <w:p>
           <w:pPr>
-            <w:pStyle w:val="TJ2"/>
+            <w:pStyle w:val="TOC2"/>
             <w:tabs>
               <w:tab w:val="left" w:pos="960"/>
               <w:tab w:val="right" w:leader="dot" w:pos="9065"/>
@@ -1871,7 +1871,7 @@
           <w:hyperlink w:anchor="_Toc234087547" w:history="1">
             <w:r>
               <w:rPr>
-                <w:rStyle w:val="Hiperhivatkozs"/>
+                <w:rStyle w:val="Hyperlink"/>
                 <w:noProof/>
               </w:rPr>
               <w:t>7.1.</w:t>
@@ -1891,7 +1891,7 @@
             </w:r>
             <w:r>
               <w:rPr>
-                <w:rStyle w:val="Hiperhivatkozs"/>
+                <w:rStyle w:val="Hyperlink"/>
                 <w:noProof/>
               </w:rPr>
               <w:t>Üzenetek általános felépítése</w:t>
@@ -1948,7 +1948,7 @@
         </w:p>
         <w:p>
           <w:pPr>
-            <w:pStyle w:val="TJ2"/>
+            <w:pStyle w:val="TOC2"/>
             <w:tabs>
               <w:tab w:val="left" w:pos="960"/>
               <w:tab w:val="right" w:leader="dot" w:pos="9065"/>
@@ -1967,7 +1967,7 @@
           <w:hyperlink w:anchor="_Toc234087548" w:history="1">
             <w:r>
               <w:rPr>
-                <w:rStyle w:val="Hiperhivatkozs"/>
+                <w:rStyle w:val="Hyperlink"/>
                 <w:i/>
                 <w:iCs/>
                 <w:noProof/>
@@ -1989,7 +1989,7 @@
             </w:r>
             <w:r>
               <w:rPr>
-                <w:rStyle w:val="Hiperhivatkozs"/>
+                <w:rStyle w:val="Hyperlink"/>
                 <w:i/>
                 <w:iCs/>
                 <w:noProof/>
@@ -2048,7 +2048,7 @@
         </w:p>
         <w:p>
           <w:pPr>
-            <w:pStyle w:val="TJ2"/>
+            <w:pStyle w:val="TOC2"/>
             <w:tabs>
               <w:tab w:val="left" w:pos="960"/>
               <w:tab w:val="right" w:leader="dot" w:pos="9065"/>
@@ -2067,7 +2067,7 @@
           <w:hyperlink w:anchor="_Toc234087549" w:history="1">
             <w:r>
               <w:rPr>
-                <w:rStyle w:val="Hiperhivatkozs"/>
+                <w:rStyle w:val="Hyperlink"/>
                 <w:i/>
                 <w:iCs/>
                 <w:noProof/>
@@ -2089,7 +2089,7 @@
             </w:r>
             <w:r>
               <w:rPr>
-                <w:rStyle w:val="Hiperhivatkozs"/>
+                <w:rStyle w:val="Hyperlink"/>
                 <w:i/>
                 <w:iCs/>
                 <w:noProof/>
@@ -2148,7 +2148,7 @@
         </w:p>
         <w:p>
           <w:pPr>
-            <w:pStyle w:val="TJ2"/>
+            <w:pStyle w:val="TOC2"/>
             <w:tabs>
               <w:tab w:val="left" w:pos="960"/>
               <w:tab w:val="right" w:leader="dot" w:pos="9065"/>
@@ -2167,7 +2167,7 @@
           <w:hyperlink w:anchor="_Toc234087550" w:history="1">
             <w:r>
               <w:rPr>
-                <w:rStyle w:val="Hiperhivatkozs"/>
+                <w:rStyle w:val="Hyperlink"/>
                 <w:i/>
                 <w:iCs/>
                 <w:noProof/>
@@ -2189,7 +2189,7 @@
             </w:r>
             <w:r>
               <w:rPr>
-                <w:rStyle w:val="Hiperhivatkozs"/>
+                <w:rStyle w:val="Hyperlink"/>
                 <w:i/>
                 <w:iCs/>
                 <w:noProof/>
@@ -2248,7 +2248,7 @@
         </w:p>
         <w:p>
           <w:pPr>
-            <w:pStyle w:val="TJ2"/>
+            <w:pStyle w:val="TOC2"/>
             <w:tabs>
               <w:tab w:val="left" w:pos="960"/>
               <w:tab w:val="right" w:leader="dot" w:pos="9065"/>
@@ -2267,7 +2267,7 @@
           <w:hyperlink w:anchor="_Toc234087551" w:history="1">
             <w:r>
               <w:rPr>
-                <w:rStyle w:val="Hiperhivatkozs"/>
+                <w:rStyle w:val="Hyperlink"/>
                 <w:noProof/>
               </w:rPr>
               <w:t>7.2.</w:t>
@@ -2287,7 +2287,7 @@
             </w:r>
             <w:r>
               <w:rPr>
-                <w:rStyle w:val="Hiperhivatkozs"/>
+                <w:rStyle w:val="Hyperlink"/>
                 <w:noProof/>
               </w:rPr>
               <w:t>Bizonylatkezelés általános struktúrái</w:t>
@@ -2344,7 +2344,7 @@
         </w:p>
         <w:p>
           <w:pPr>
-            <w:pStyle w:val="TJ2"/>
+            <w:pStyle w:val="TOC2"/>
             <w:tabs>
               <w:tab w:val="left" w:pos="960"/>
               <w:tab w:val="right" w:leader="dot" w:pos="9065"/>
@@ -2363,7 +2363,7 @@
           <w:hyperlink w:anchor="_Toc234087552" w:history="1">
             <w:r>
               <w:rPr>
-                <w:rStyle w:val="Hiperhivatkozs"/>
+                <w:rStyle w:val="Hyperlink"/>
                 <w:i/>
                 <w:iCs/>
                 <w:noProof/>
@@ -2385,7 +2385,7 @@
             </w:r>
             <w:r>
               <w:rPr>
-                <w:rStyle w:val="Hiperhivatkozs"/>
+                <w:rStyle w:val="Hyperlink"/>
                 <w:i/>
                 <w:iCs/>
                 <w:noProof/>
@@ -2444,7 +2444,7 @@
         </w:p>
         <w:p>
           <w:pPr>
-            <w:pStyle w:val="TJ2"/>
+            <w:pStyle w:val="TOC2"/>
             <w:tabs>
               <w:tab w:val="left" w:pos="960"/>
               <w:tab w:val="right" w:leader="dot" w:pos="9065"/>
@@ -2463,7 +2463,7 @@
           <w:hyperlink w:anchor="_Toc234087553" w:history="1">
             <w:r>
               <w:rPr>
-                <w:rStyle w:val="Hiperhivatkozs"/>
+                <w:rStyle w:val="Hyperlink"/>
                 <w:noProof/>
               </w:rPr>
               <w:t>7.3.</w:t>
@@ -2483,7 +2483,7 @@
             </w:r>
             <w:r>
               <w:rPr>
-                <w:rStyle w:val="Hiperhivatkozs"/>
+                <w:rStyle w:val="Hyperlink"/>
                 <w:noProof/>
               </w:rPr>
               <w:t>Bizonylatkezelés interfész</w:t>
@@ -2540,7 +2540,7 @@
         </w:p>
         <w:p>
           <w:pPr>
-            <w:pStyle w:val="TJ2"/>
+            <w:pStyle w:val="TOC2"/>
             <w:tabs>
               <w:tab w:val="left" w:pos="960"/>
               <w:tab w:val="right" w:leader="dot" w:pos="9065"/>
@@ -2559,7 +2559,7 @@
           <w:hyperlink w:anchor="_Toc234087554" w:history="1">
             <w:r>
               <w:rPr>
-                <w:rStyle w:val="Hiperhivatkozs"/>
+                <w:rStyle w:val="Hyperlink"/>
                 <w:i/>
                 <w:iCs/>
                 <w:noProof/>
@@ -2581,7 +2581,7 @@
             </w:r>
             <w:r>
               <w:rPr>
-                <w:rStyle w:val="Hiperhivatkozs"/>
+                <w:rStyle w:val="Hyperlink"/>
                 <w:i/>
                 <w:iCs/>
                 <w:noProof/>
@@ -2640,7 +2640,7 @@
         </w:p>
         <w:p>
           <w:pPr>
-            <w:pStyle w:val="TJ2"/>
+            <w:pStyle w:val="TOC2"/>
             <w:tabs>
               <w:tab w:val="left" w:pos="960"/>
               <w:tab w:val="right" w:leader="dot" w:pos="9065"/>
@@ -2659,7 +2659,7 @@
           <w:hyperlink w:anchor="_Toc234087555" w:history="1">
             <w:r>
               <w:rPr>
-                <w:rStyle w:val="Hiperhivatkozs"/>
+                <w:rStyle w:val="Hyperlink"/>
                 <w:i/>
                 <w:iCs/>
                 <w:noProof/>
@@ -2681,7 +2681,7 @@
             </w:r>
             <w:r>
               <w:rPr>
-                <w:rStyle w:val="Hiperhivatkozs"/>
+                <w:rStyle w:val="Hyperlink"/>
                 <w:i/>
                 <w:iCs/>
                 <w:noProof/>
@@ -2740,7 +2740,7 @@
         </w:p>
         <w:p>
           <w:pPr>
-            <w:pStyle w:val="TJ2"/>
+            <w:pStyle w:val="TOC2"/>
             <w:tabs>
               <w:tab w:val="left" w:pos="960"/>
               <w:tab w:val="right" w:leader="dot" w:pos="9065"/>
@@ -2759,7 +2759,7 @@
           <w:hyperlink w:anchor="_Toc234087556" w:history="1">
             <w:r>
               <w:rPr>
-                <w:rStyle w:val="Hiperhivatkozs"/>
+                <w:rStyle w:val="Hyperlink"/>
                 <w:i/>
                 <w:iCs/>
                 <w:noProof/>
@@ -2781,7 +2781,7 @@
             </w:r>
             <w:r>
               <w:rPr>
-                <w:rStyle w:val="Hiperhivatkozs"/>
+                <w:rStyle w:val="Hyperlink"/>
                 <w:i/>
                 <w:iCs/>
                 <w:noProof/>
@@ -2840,7 +2840,7 @@
         </w:p>
         <w:p>
           <w:pPr>
-            <w:pStyle w:val="TJ2"/>
+            <w:pStyle w:val="TOC2"/>
             <w:tabs>
               <w:tab w:val="left" w:pos="960"/>
               <w:tab w:val="right" w:leader="dot" w:pos="9065"/>
@@ -2859,7 +2859,7 @@
           <w:hyperlink w:anchor="_Toc234087557" w:history="1">
             <w:r>
               <w:rPr>
-                <w:rStyle w:val="Hiperhivatkozs"/>
+                <w:rStyle w:val="Hyperlink"/>
                 <w:i/>
                 <w:iCs/>
                 <w:noProof/>
@@ -2881,7 +2881,7 @@
             </w:r>
             <w:r>
               <w:rPr>
-                <w:rStyle w:val="Hiperhivatkozs"/>
+                <w:rStyle w:val="Hyperlink"/>
                 <w:i/>
                 <w:iCs/>
                 <w:noProof/>
@@ -2940,7 +2940,7 @@
         </w:p>
         <w:p>
           <w:pPr>
-            <w:pStyle w:val="TJ2"/>
+            <w:pStyle w:val="TOC2"/>
             <w:tabs>
               <w:tab w:val="left" w:pos="960"/>
               <w:tab w:val="right" w:leader="dot" w:pos="9065"/>
@@ -2959,7 +2959,7 @@
           <w:hyperlink w:anchor="_Toc234087558" w:history="1">
             <w:r>
               <w:rPr>
-                <w:rStyle w:val="Hiperhivatkozs"/>
+                <w:rStyle w:val="Hyperlink"/>
                 <w:i/>
                 <w:iCs/>
                 <w:noProof/>
@@ -2981,7 +2981,7 @@
             </w:r>
             <w:r>
               <w:rPr>
-                <w:rStyle w:val="Hiperhivatkozs"/>
+                <w:rStyle w:val="Hyperlink"/>
                 <w:i/>
                 <w:iCs/>
                 <w:noProof/>
@@ -3040,7 +3040,7 @@
         </w:p>
         <w:p>
           <w:pPr>
-            <w:pStyle w:val="TJ2"/>
+            <w:pStyle w:val="TOC2"/>
             <w:tabs>
               <w:tab w:val="left" w:pos="960"/>
               <w:tab w:val="right" w:leader="dot" w:pos="9065"/>
@@ -3059,7 +3059,7 @@
           <w:hyperlink w:anchor="_Toc234087559" w:history="1">
             <w:r>
               <w:rPr>
-                <w:rStyle w:val="Hiperhivatkozs"/>
+                <w:rStyle w:val="Hyperlink"/>
                 <w:i/>
                 <w:iCs/>
                 <w:noProof/>
@@ -3081,7 +3081,7 @@
             </w:r>
             <w:r>
               <w:rPr>
-                <w:rStyle w:val="Hiperhivatkozs"/>
+                <w:rStyle w:val="Hyperlink"/>
                 <w:i/>
                 <w:iCs/>
                 <w:noProof/>
@@ -3140,7 +3140,7 @@
         </w:p>
         <w:p>
           <w:pPr>
-            <w:pStyle w:val="TJ1"/>
+            <w:pStyle w:val="TOC1"/>
             <w:tabs>
               <w:tab w:val="left" w:pos="464"/>
               <w:tab w:val="right" w:leader="dot" w:pos="9065"/>
@@ -3159,7 +3159,7 @@
           <w:hyperlink w:anchor="_Toc234087560" w:history="1">
             <w:r>
               <w:rPr>
-                <w:rStyle w:val="Hiperhivatkozs"/>
+                <w:rStyle w:val="Hyperlink"/>
                 <w:noProof/>
               </w:rPr>
               <w:t>8.</w:t>
@@ -3179,7 +3179,7 @@
             </w:r>
             <w:r>
               <w:rPr>
-                <w:rStyle w:val="Hiperhivatkozs"/>
+                <w:rStyle w:val="Hyperlink"/>
                 <w:noProof/>
               </w:rPr>
               <w:t>SOAP interfész</w:t>
@@ -3236,7 +3236,7 @@
         </w:p>
         <w:p>
           <w:pPr>
-            <w:pStyle w:val="TJ2"/>
+            <w:pStyle w:val="TOC2"/>
             <w:tabs>
               <w:tab w:val="left" w:pos="960"/>
               <w:tab w:val="right" w:leader="dot" w:pos="9065"/>
@@ -3255,7 +3255,7 @@
           <w:hyperlink w:anchor="_Toc234087561" w:history="1">
             <w:r>
               <w:rPr>
-                <w:rStyle w:val="Hiperhivatkozs"/>
+                <w:rStyle w:val="Hyperlink"/>
                 <w:noProof/>
               </w:rPr>
               <w:t>8.1.</w:t>
@@ -3275,7 +3275,7 @@
             </w:r>
             <w:r>
               <w:rPr>
-                <w:rStyle w:val="Hiperhivatkozs"/>
+                <w:rStyle w:val="Hyperlink"/>
                 <w:noProof/>
               </w:rPr>
               <w:t>Üzenetek általános felépítése</w:t>
@@ -3332,7 +3332,7 @@
         </w:p>
         <w:p>
           <w:pPr>
-            <w:pStyle w:val="TJ2"/>
+            <w:pStyle w:val="TOC2"/>
             <w:tabs>
               <w:tab w:val="left" w:pos="960"/>
               <w:tab w:val="right" w:leader="dot" w:pos="9065"/>
@@ -3351,7 +3351,7 @@
           <w:hyperlink w:anchor="_Toc234087562" w:history="1">
             <w:r>
               <w:rPr>
-                <w:rStyle w:val="Hiperhivatkozs"/>
+                <w:rStyle w:val="Hyperlink"/>
                 <w:i/>
                 <w:iCs/>
                 <w:noProof/>
@@ -3373,7 +3373,7 @@
             </w:r>
             <w:r>
               <w:rPr>
-                <w:rStyle w:val="Hiperhivatkozs"/>
+                <w:rStyle w:val="Hyperlink"/>
                 <w:i/>
                 <w:iCs/>
                 <w:noProof/>
@@ -3432,7 +3432,7 @@
         </w:p>
         <w:p>
           <w:pPr>
-            <w:pStyle w:val="TJ2"/>
+            <w:pStyle w:val="TOC2"/>
             <w:tabs>
               <w:tab w:val="left" w:pos="960"/>
               <w:tab w:val="right" w:leader="dot" w:pos="9065"/>
@@ -3451,7 +3451,7 @@
           <w:hyperlink w:anchor="_Toc234087563" w:history="1">
             <w:r>
               <w:rPr>
-                <w:rStyle w:val="Hiperhivatkozs"/>
+                <w:rStyle w:val="Hyperlink"/>
                 <w:i/>
                 <w:iCs/>
                 <w:noProof/>
@@ -3473,7 +3473,7 @@
             </w:r>
             <w:r>
               <w:rPr>
-                <w:rStyle w:val="Hiperhivatkozs"/>
+                <w:rStyle w:val="Hyperlink"/>
                 <w:i/>
                 <w:iCs/>
                 <w:noProof/>
@@ -3532,7 +3532,7 @@
         </w:p>
         <w:p>
           <w:pPr>
-            <w:pStyle w:val="TJ2"/>
+            <w:pStyle w:val="TOC2"/>
             <w:tabs>
               <w:tab w:val="left" w:pos="960"/>
               <w:tab w:val="right" w:leader="dot" w:pos="9065"/>
@@ -3551,7 +3551,7 @@
           <w:hyperlink w:anchor="_Toc234087564" w:history="1">
             <w:r>
               <w:rPr>
-                <w:rStyle w:val="Hiperhivatkozs"/>
+                <w:rStyle w:val="Hyperlink"/>
                 <w:noProof/>
               </w:rPr>
               <w:t>8.2.</w:t>
@@ -3571,7 +3571,7 @@
             </w:r>
             <w:r>
               <w:rPr>
-                <w:rStyle w:val="Hiperhivatkozs"/>
+                <w:rStyle w:val="Hyperlink"/>
                 <w:noProof/>
               </w:rPr>
               <w:t>Bizonylatkezelés általános struktúrái</w:t>
@@ -3628,7 +3628,7 @@
         </w:p>
         <w:p>
           <w:pPr>
-            <w:pStyle w:val="TJ2"/>
+            <w:pStyle w:val="TOC2"/>
             <w:tabs>
               <w:tab w:val="left" w:pos="960"/>
               <w:tab w:val="right" w:leader="dot" w:pos="9065"/>
@@ -3647,7 +3647,7 @@
           <w:hyperlink w:anchor="_Toc234087565" w:history="1">
             <w:r>
               <w:rPr>
-                <w:rStyle w:val="Hiperhivatkozs"/>
+                <w:rStyle w:val="Hyperlink"/>
                 <w:i/>
                 <w:iCs/>
                 <w:noProof/>
@@ -3669,7 +3669,7 @@
             </w:r>
             <w:r>
               <w:rPr>
-                <w:rStyle w:val="Hiperhivatkozs"/>
+                <w:rStyle w:val="Hyperlink"/>
                 <w:i/>
                 <w:iCs/>
                 <w:noProof/>
@@ -3728,7 +3728,7 @@
         </w:p>
         <w:p>
           <w:pPr>
-            <w:pStyle w:val="TJ2"/>
+            <w:pStyle w:val="TOC2"/>
             <w:tabs>
               <w:tab w:val="left" w:pos="960"/>
               <w:tab w:val="right" w:leader="dot" w:pos="9065"/>
@@ -3747,7 +3747,7 @@
           <w:hyperlink w:anchor="_Toc234087566" w:history="1">
             <w:r>
               <w:rPr>
-                <w:rStyle w:val="Hiperhivatkozs"/>
+                <w:rStyle w:val="Hyperlink"/>
                 <w:noProof/>
               </w:rPr>
               <w:t>8.3.</w:t>
@@ -3767,7 +3767,7 @@
             </w:r>
             <w:r>
               <w:rPr>
-                <w:rStyle w:val="Hiperhivatkozs"/>
+                <w:rStyle w:val="Hyperlink"/>
                 <w:noProof/>
               </w:rPr>
               <w:t>Bizonylatkezelés interfésze</w:t>
@@ -3824,7 +3824,7 @@
         </w:p>
         <w:p>
           <w:pPr>
-            <w:pStyle w:val="TJ2"/>
+            <w:pStyle w:val="TOC2"/>
             <w:tabs>
               <w:tab w:val="left" w:pos="960"/>
               <w:tab w:val="right" w:leader="dot" w:pos="9065"/>
@@ -3843,7 +3843,7 @@
           <w:hyperlink w:anchor="_Toc234087567" w:history="1">
             <w:r>
               <w:rPr>
-                <w:rStyle w:val="Hiperhivatkozs"/>
+                <w:rStyle w:val="Hyperlink"/>
                 <w:i/>
                 <w:iCs/>
                 <w:noProof/>
@@ -3865,7 +3865,7 @@
             </w:r>
             <w:r>
               <w:rPr>
-                <w:rStyle w:val="Hiperhivatkozs"/>
+                <w:rStyle w:val="Hyperlink"/>
                 <w:i/>
                 <w:iCs/>
                 <w:noProof/>
@@ -3924,7 +3924,7 @@
         </w:p>
         <w:p>
           <w:pPr>
-            <w:pStyle w:val="TJ2"/>
+            <w:pStyle w:val="TOC2"/>
             <w:tabs>
               <w:tab w:val="left" w:pos="960"/>
               <w:tab w:val="right" w:leader="dot" w:pos="9065"/>
@@ -3943,7 +3943,7 @@
           <w:hyperlink w:anchor="_Toc234087568" w:history="1">
             <w:r>
               <w:rPr>
-                <w:rStyle w:val="Hiperhivatkozs"/>
+                <w:rStyle w:val="Hyperlink"/>
                 <w:i/>
                 <w:iCs/>
                 <w:noProof/>
@@ -3965,7 +3965,7 @@
             </w:r>
             <w:r>
               <w:rPr>
-                <w:rStyle w:val="Hiperhivatkozs"/>
+                <w:rStyle w:val="Hyperlink"/>
                 <w:i/>
                 <w:iCs/>
                 <w:noProof/>
@@ -4024,7 +4024,7 @@
         </w:p>
         <w:p>
           <w:pPr>
-            <w:pStyle w:val="TJ2"/>
+            <w:pStyle w:val="TOC2"/>
             <w:tabs>
               <w:tab w:val="left" w:pos="960"/>
               <w:tab w:val="right" w:leader="dot" w:pos="9065"/>
@@ -4043,7 +4043,7 @@
           <w:hyperlink w:anchor="_Toc234087569" w:history="1">
             <w:r>
               <w:rPr>
-                <w:rStyle w:val="Hiperhivatkozs"/>
+                <w:rStyle w:val="Hyperlink"/>
                 <w:i/>
                 <w:iCs/>
                 <w:noProof/>
@@ -4065,7 +4065,7 @@
             </w:r>
             <w:r>
               <w:rPr>
-                <w:rStyle w:val="Hiperhivatkozs"/>
+                <w:rStyle w:val="Hyperlink"/>
                 <w:i/>
                 <w:iCs/>
                 <w:noProof/>
@@ -4124,7 +4124,7 @@
         </w:p>
         <w:p>
           <w:pPr>
-            <w:pStyle w:val="TJ2"/>
+            <w:pStyle w:val="TOC2"/>
             <w:tabs>
               <w:tab w:val="left" w:pos="960"/>
               <w:tab w:val="right" w:leader="dot" w:pos="9065"/>
@@ -4143,7 +4143,7 @@
           <w:hyperlink w:anchor="_Toc234087570" w:history="1">
             <w:r>
               <w:rPr>
-                <w:rStyle w:val="Hiperhivatkozs"/>
+                <w:rStyle w:val="Hyperlink"/>
                 <w:i/>
                 <w:iCs/>
                 <w:noProof/>
@@ -4165,7 +4165,7 @@
             </w:r>
             <w:r>
               <w:rPr>
-                <w:rStyle w:val="Hiperhivatkozs"/>
+                <w:rStyle w:val="Hyperlink"/>
                 <w:i/>
                 <w:iCs/>
                 <w:noProof/>
@@ -4224,7 +4224,7 @@
         </w:p>
         <w:p>
           <w:pPr>
-            <w:pStyle w:val="TJ2"/>
+            <w:pStyle w:val="TOC2"/>
             <w:tabs>
               <w:tab w:val="left" w:pos="960"/>
               <w:tab w:val="right" w:leader="dot" w:pos="9065"/>
@@ -4243,7 +4243,7 @@
           <w:hyperlink w:anchor="_Toc234087571" w:history="1">
             <w:r>
               <w:rPr>
-                <w:rStyle w:val="Hiperhivatkozs"/>
+                <w:rStyle w:val="Hyperlink"/>
                 <w:i/>
                 <w:iCs/>
                 <w:noProof/>
@@ -4265,7 +4265,7 @@
             </w:r>
             <w:r>
               <w:rPr>
-                <w:rStyle w:val="Hiperhivatkozs"/>
+                <w:rStyle w:val="Hyperlink"/>
                 <w:i/>
                 <w:iCs/>
                 <w:noProof/>
@@ -4324,7 +4324,7 @@
         </w:p>
         <w:p>
           <w:pPr>
-            <w:pStyle w:val="TJ2"/>
+            <w:pStyle w:val="TOC2"/>
             <w:tabs>
               <w:tab w:val="left" w:pos="960"/>
               <w:tab w:val="right" w:leader="dot" w:pos="9065"/>
@@ -4343,7 +4343,7 @@
           <w:hyperlink w:anchor="_Toc234087572" w:history="1">
             <w:r>
               <w:rPr>
-                <w:rStyle w:val="Hiperhivatkozs"/>
+                <w:rStyle w:val="Hyperlink"/>
                 <w:i/>
                 <w:iCs/>
                 <w:noProof/>
@@ -4365,7 +4365,7 @@
             </w:r>
             <w:r>
               <w:rPr>
-                <w:rStyle w:val="Hiperhivatkozs"/>
+                <w:rStyle w:val="Hyperlink"/>
                 <w:i/>
                 <w:iCs/>
                 <w:noProof/>
@@ -4424,7 +4424,7 @@
         </w:p>
         <w:p>
           <w:pPr>
-            <w:pStyle w:val="TJ1"/>
+            <w:pStyle w:val="TOC1"/>
             <w:tabs>
               <w:tab w:val="left" w:pos="464"/>
               <w:tab w:val="right" w:leader="dot" w:pos="9065"/>
@@ -4443,7 +4443,7 @@
           <w:hyperlink w:anchor="_Toc234087573" w:history="1">
             <w:r>
               <w:rPr>
-                <w:rStyle w:val="Hiperhivatkozs"/>
+                <w:rStyle w:val="Hyperlink"/>
                 <w:noProof/>
               </w:rPr>
               <w:t>9.</w:t>
@@ -4463,7 +4463,7 @@
             </w:r>
             <w:r>
               <w:rPr>
-                <w:rStyle w:val="Hiperhivatkozs"/>
+                <w:rStyle w:val="Hyperlink"/>
                 <w:noProof/>
               </w:rPr>
               <w:t>Környezetek elérhetősége</w:t>
@@ -4921,7 +4921,7 @@
     </w:p>
     <w:tbl>
       <w:tblPr>
-        <w:tblStyle w:val="Tblzatrcsos45jellszn"/>
+        <w:tblStyle w:val="GridTable4-Accent5"/>
         <w:tblW w:w="0" w:type="auto"/>
         <w:tblLook w:val="04A0" w:firstRow="1" w:lastRow="0" w:firstColumn="1" w:lastColumn="0" w:noHBand="0" w:noVBand="1"/>
       </w:tblPr>
@@ -5425,7 +5425,10 @@
             </w:r>
             <w:proofErr w:type="spellEnd"/>
             <w:r>
-              <w:t xml:space="preserve"> ÁFA bevallás, aminek kódja 65.</w:t>
+              <w:t xml:space="preserve"> </w:t>
+            </w:r>
+            <w:r>
+              <w:t>T1042E</w:t>
             </w:r>
           </w:p>
         </w:tc>
@@ -5999,15 +6002,7 @@
               <w:cnfStyle w:val="000000000000" w:firstRow="0" w:lastRow="0" w:firstColumn="0" w:lastColumn="0" w:oddVBand="0" w:evenVBand="0" w:oddHBand="0" w:evenHBand="0" w:firstRowFirstColumn="0" w:firstRowLastColumn="0" w:lastRowFirstColumn="0" w:lastRowLastColumn="0"/>
             </w:pPr>
             <w:r>
-              <w:t xml:space="preserve">A részbizonylatok egy funkcionálisan jól elkülöníthető csoportja. </w:t>
-            </w:r>
-            <w:proofErr w:type="spellStart"/>
-            <w:r>
-              <w:t>Pl</w:t>
-            </w:r>
-            <w:proofErr w:type="spellEnd"/>
-            <w:r>
-              <w:t xml:space="preserve"> ÁFA bevallás főbizonylat, aminek kódja 65A.</w:t>
+              <w:t>A részbizonylatok egy funkcionálisan jól elkülöníthető csoportja.</w:t>
             </w:r>
           </w:p>
         </w:tc>
@@ -6276,7 +6271,7 @@
     </w:p>
     <w:p>
       <w:pPr>
-        <w:pStyle w:val="Cmsor1"/>
+        <w:pStyle w:val="Heading1"/>
         <w:numPr>
           <w:ilvl w:val="0"/>
           <w:numId w:val="3"/>
@@ -6421,7 +6416,7 @@
     </w:p>
     <w:p>
       <w:pPr>
-        <w:pStyle w:val="Cmsor1"/>
+        <w:pStyle w:val="Heading1"/>
         <w:numPr>
           <w:ilvl w:val="0"/>
           <w:numId w:val="3"/>
@@ -6443,7 +6438,7 @@
     </w:p>
     <w:p>
       <w:pPr>
-        <w:pStyle w:val="Cmsor1"/>
+        <w:pStyle w:val="Heading1"/>
         <w:numPr>
           <w:ilvl w:val="0"/>
           <w:numId w:val="3"/>
@@ -6462,7 +6457,7 @@
     </w:p>
     <w:p>
       <w:pPr>
-        <w:pStyle w:val="Cmsor2"/>
+        <w:pStyle w:val="Heading2"/>
         <w:numPr>
           <w:ilvl w:val="1"/>
           <w:numId w:val="3"/>
@@ -6481,7 +6476,7 @@
     </w:p>
     <w:p>
       <w:pPr>
-        <w:pStyle w:val="Listaszerbekezds"/>
+        <w:pStyle w:val="ListParagraph"/>
         <w:numPr>
           <w:ilvl w:val="0"/>
           <w:numId w:val="7"/>
@@ -6493,7 +6488,7 @@
     </w:p>
     <w:p>
       <w:pPr>
-        <w:pStyle w:val="Listaszerbekezds"/>
+        <w:pStyle w:val="ListParagraph"/>
         <w:numPr>
           <w:ilvl w:val="0"/>
           <w:numId w:val="7"/>
@@ -6505,7 +6500,7 @@
     </w:p>
     <w:p>
       <w:pPr>
-        <w:pStyle w:val="Listaszerbekezds"/>
+        <w:pStyle w:val="ListParagraph"/>
         <w:numPr>
           <w:ilvl w:val="0"/>
           <w:numId w:val="7"/>
@@ -6517,7 +6512,7 @@
     </w:p>
     <w:p>
       <w:pPr>
-        <w:pStyle w:val="Listaszerbekezds"/>
+        <w:pStyle w:val="ListParagraph"/>
         <w:numPr>
           <w:ilvl w:val="0"/>
           <w:numId w:val="7"/>
@@ -6529,7 +6524,7 @@
     </w:p>
     <w:p>
       <w:pPr>
-        <w:pStyle w:val="Listaszerbekezds"/>
+        <w:pStyle w:val="ListParagraph"/>
         <w:numPr>
           <w:ilvl w:val="0"/>
           <w:numId w:val="7"/>
@@ -6541,7 +6536,7 @@
     </w:p>
     <w:p>
       <w:pPr>
-        <w:pStyle w:val="Cmsor2"/>
+        <w:pStyle w:val="Heading2"/>
         <w:numPr>
           <w:ilvl w:val="1"/>
           <w:numId w:val="3"/>
@@ -6563,7 +6558,7 @@
     </w:p>
     <w:p>
       <w:pPr>
-        <w:pStyle w:val="Listaszerbekezds"/>
+        <w:pStyle w:val="ListParagraph"/>
         <w:numPr>
           <w:ilvl w:val="0"/>
           <w:numId w:val="7"/>
@@ -6575,7 +6570,7 @@
     </w:p>
     <w:p>
       <w:pPr>
-        <w:pStyle w:val="Cmsor1"/>
+        <w:pStyle w:val="Heading1"/>
         <w:numPr>
           <w:ilvl w:val="0"/>
           <w:numId w:val="3"/>
@@ -6636,7 +6631,7 @@
     </w:p>
     <w:p>
       <w:pPr>
-        <w:pStyle w:val="Cmsor1"/>
+        <w:pStyle w:val="Heading1"/>
         <w:numPr>
           <w:ilvl w:val="0"/>
           <w:numId w:val="3"/>
@@ -6659,7 +6654,7 @@
     </w:p>
     <w:p>
       <w:pPr>
-        <w:pStyle w:val="Listaszerbekezds"/>
+        <w:pStyle w:val="ListParagraph"/>
         <w:numPr>
           <w:ilvl w:val="0"/>
           <w:numId w:val="18"/>
@@ -6679,14 +6674,13 @@
     </w:p>
     <w:p>
       <w:pPr>
-        <w:pStyle w:val="Listaszerbekezds"/>
+        <w:pStyle w:val="ListParagraph"/>
         <w:numPr>
           <w:ilvl w:val="0"/>
           <w:numId w:val="18"/>
         </w:numPr>
         <w:jc w:val="both"/>
       </w:pPr>
-      <w:proofErr w:type="gramStart"/>
       <w:r>
         <w:rPr>
           <w:b/>
@@ -6695,23 +6689,18 @@
         <w:t>validáció</w:t>
       </w:r>
       <w:r>
-        <w:t xml:space="preserve">:   </w:t>
-      </w:r>
-      <w:proofErr w:type="gramEnd"/>
-      <w:r>
-        <w:t>A bizonylat tartalmi validációját végzi.</w:t>
+        <w:t>:   A bizonylat tartalmi validációját végzi.</w:t>
       </w:r>
     </w:p>
     <w:p>
       <w:pPr>
-        <w:pStyle w:val="Listaszerbekezds"/>
+        <w:pStyle w:val="ListParagraph"/>
         <w:numPr>
           <w:ilvl w:val="0"/>
           <w:numId w:val="18"/>
         </w:numPr>
         <w:jc w:val="both"/>
       </w:pPr>
-      <w:proofErr w:type="gramStart"/>
       <w:r>
         <w:rPr>
           <w:b/>
@@ -6720,11 +6709,7 @@
         <w:t>beküldés</w:t>
       </w:r>
       <w:r>
-        <w:t xml:space="preserve">:   </w:t>
-      </w:r>
-      <w:proofErr w:type="gramEnd"/>
-      <w:r>
-        <w:t>A bizonylatot továbbítja a szakrendszernek feldolgozásra.</w:t>
+        <w:t>:   A bizonylatot továbbítja a szakrendszernek feldolgozásra.</w:t>
       </w:r>
     </w:p>
     <w:p>
@@ -6751,7 +6736,7 @@
     </w:p>
     <w:p>
       <w:pPr>
-        <w:pStyle w:val="Cmsor2"/>
+        <w:pStyle w:val="Heading2"/>
         <w:numPr>
           <w:ilvl w:val="1"/>
           <w:numId w:val="3"/>
@@ -6791,7 +6776,7 @@
     </w:p>
     <w:p>
       <w:pPr>
-        <w:pStyle w:val="Cmsor2"/>
+        <w:pStyle w:val="Heading2"/>
         <w:numPr>
           <w:ilvl w:val="1"/>
           <w:numId w:val="3"/>
@@ -6831,7 +6816,7 @@
     </w:p>
     <w:p>
       <w:pPr>
-        <w:pStyle w:val="Cmsor2"/>
+        <w:pStyle w:val="Heading2"/>
         <w:numPr>
           <w:ilvl w:val="1"/>
           <w:numId w:val="3"/>
@@ -6863,7 +6848,7 @@
     </w:p>
     <w:p>
       <w:pPr>
-        <w:pStyle w:val="Cmsor2"/>
+        <w:pStyle w:val="Heading2"/>
         <w:numPr>
           <w:ilvl w:val="1"/>
           <w:numId w:val="3"/>
@@ -6925,7 +6910,7 @@
     </w:p>
     <w:p>
       <w:pPr>
-        <w:pStyle w:val="Cmsor2"/>
+        <w:pStyle w:val="Heading2"/>
         <w:numPr>
           <w:ilvl w:val="0"/>
           <w:numId w:val="0"/>
@@ -6940,7 +6925,7 @@
     </w:p>
     <w:p>
       <w:pPr>
-        <w:pStyle w:val="Cmsor1"/>
+        <w:pStyle w:val="Heading1"/>
         <w:numPr>
           <w:ilvl w:val="0"/>
           <w:numId w:val="3"/>
@@ -6955,7 +6940,7 @@
     </w:p>
     <w:p>
       <w:pPr>
-        <w:pStyle w:val="Cmsor2"/>
+        <w:pStyle w:val="Heading2"/>
         <w:numPr>
           <w:ilvl w:val="1"/>
           <w:numId w:val="3"/>
@@ -6986,7 +6971,7 @@
     </w:p>
     <w:p>
       <w:pPr>
-        <w:pStyle w:val="Cmsor2"/>
+        <w:pStyle w:val="Heading2"/>
         <w:numPr>
           <w:ilvl w:val="1"/>
           <w:numId w:val="3"/>
@@ -7028,7 +7013,7 @@
     </w:p>
     <w:p>
       <w:pPr>
-        <w:pStyle w:val="Cmsor2"/>
+        <w:pStyle w:val="Heading2"/>
         <w:numPr>
           <w:ilvl w:val="2"/>
           <w:numId w:val="3"/>
@@ -7137,7 +7122,7 @@
     </w:p>
     <w:p>
       <w:pPr>
-        <w:pStyle w:val="Cmsor1"/>
+        <w:pStyle w:val="Heading1"/>
         <w:numPr>
           <w:ilvl w:val="0"/>
           <w:numId w:val="3"/>
@@ -7155,7 +7140,7 @@
     </w:p>
     <w:p>
       <w:pPr>
-        <w:pStyle w:val="Cmsor2"/>
+        <w:pStyle w:val="Heading2"/>
         <w:numPr>
           <w:ilvl w:val="1"/>
           <w:numId w:val="3"/>
@@ -7169,7 +7154,7 @@
     </w:p>
     <w:p>
       <w:pPr>
-        <w:pStyle w:val="Cmsor2"/>
+        <w:pStyle w:val="Heading2"/>
         <w:numPr>
           <w:ilvl w:val="2"/>
           <w:numId w:val="3"/>
@@ -7238,7 +7223,7 @@
     </w:p>
     <w:tbl>
       <w:tblPr>
-        <w:tblStyle w:val="Rcsostblzat"/>
+        <w:tblStyle w:val="TableGrid0"/>
         <w:tblW w:w="0" w:type="auto"/>
         <w:shd w:val="clear" w:color="auto" w:fill="D9D9D9" w:themeFill="background1" w:themeFillShade="D9"/>
         <w:tblLook w:val="04A0" w:firstRow="1" w:lastRow="0" w:firstColumn="1" w:lastColumn="0" w:noHBand="0" w:noVBand="1"/>
@@ -7603,7 +7588,7 @@
     </w:p>
     <w:tbl>
       <w:tblPr>
-        <w:tblStyle w:val="Rcsostblzat"/>
+        <w:tblStyle w:val="TableGrid0"/>
         <w:tblW w:w="9067" w:type="dxa"/>
         <w:shd w:val="clear" w:color="auto" w:fill="D9D9D9" w:themeFill="background1" w:themeFillShade="D9"/>
         <w:tblLook w:val="04A0" w:firstRow="1" w:lastRow="0" w:firstColumn="1" w:lastColumn="0" w:noHBand="0" w:noVBand="1"/>
@@ -7745,15 +7730,7 @@
               <w:jc w:val="center"/>
             </w:pPr>
             <w:r>
-              <w:t>[0-9a-fA-F]{</w:t>
-            </w:r>
-            <w:proofErr w:type="gramStart"/>
-            <w:r>
-              <w:t>8}-(</w:t>
-            </w:r>
-            <w:proofErr w:type="gramEnd"/>
-            <w:r>
-              <w:t>[0-9a-fA-F]{4}-){3}[0-9a-fA-F]{12}</w:t>
+              <w:t>[0-9a-fA-F]{8}-([0-9a-fA-F]{4}-){3}[0-9a-fA-F]{12}</w:t>
             </w:r>
           </w:p>
         </w:tc>
@@ -7813,15 +7790,7 @@
               <w:jc w:val="center"/>
             </w:pPr>
             <w:r>
-              <w:t>[0-9a-fA-F]{</w:t>
-            </w:r>
-            <w:proofErr w:type="gramStart"/>
-            <w:r>
-              <w:t>8}-(</w:t>
-            </w:r>
-            <w:proofErr w:type="gramEnd"/>
-            <w:r>
-              <w:t>[0-9a-fA-F]{4}-){3}[0-9a-fA-F]{12}</w:t>
+              <w:t>[0-9a-fA-F]{8}-([0-9a-fA-F]{4}-){3}[0-9a-fA-F]{12}</w:t>
             </w:r>
           </w:p>
         </w:tc>
@@ -7877,16 +7846,11 @@
             <w:pPr>
               <w:jc w:val="center"/>
             </w:pPr>
-            <w:proofErr w:type="gramStart"/>
             <w:r>
               <w:t>.</w:t>
             </w:r>
             <w:r>
-              <w:t>{</w:t>
-            </w:r>
-            <w:proofErr w:type="gramEnd"/>
-            <w:r>
-              <w:t>2</w:t>
+              <w:t>{2</w:t>
             </w:r>
             <w:r>
               <w:t>172</w:t>
@@ -7915,7 +7879,7 @@
     <w:p/>
     <w:p>
       <w:pPr>
-        <w:pStyle w:val="Cmsor2"/>
+        <w:pStyle w:val="Heading2"/>
         <w:numPr>
           <w:ilvl w:val="2"/>
           <w:numId w:val="3"/>
@@ -8013,7 +7977,7 @@
     </w:p>
     <w:tbl>
       <w:tblPr>
-        <w:tblStyle w:val="Rcsostblzat"/>
+        <w:tblStyle w:val="TableGrid0"/>
         <w:tblW w:w="0" w:type="auto"/>
         <w:shd w:val="clear" w:color="auto" w:fill="D9D9D9" w:themeFill="background1" w:themeFillShade="D9"/>
         <w:tblLook w:val="04A0" w:firstRow="1" w:lastRow="0" w:firstColumn="1" w:lastColumn="0" w:noHBand="0" w:noVBand="1"/>
@@ -8259,7 +8223,7 @@
     <w:p/>
     <w:p>
       <w:pPr>
-        <w:pStyle w:val="Cmsor2"/>
+        <w:pStyle w:val="Heading2"/>
         <w:numPr>
           <w:ilvl w:val="2"/>
           <w:numId w:val="3"/>
@@ -8307,7 +8271,7 @@
     </w:p>
     <w:tbl>
       <w:tblPr>
-        <w:tblStyle w:val="Rcsostblzat"/>
+        <w:tblStyle w:val="TableGrid0"/>
         <w:tblW w:w="0" w:type="auto"/>
         <w:jc w:val="center"/>
         <w:tblLook w:val="04A0" w:firstRow="1" w:lastRow="0" w:firstColumn="1" w:lastColumn="0" w:noHBand="0" w:noVBand="1"/>
@@ -8586,7 +8550,7 @@
     </w:p>
     <w:p>
       <w:pPr>
-        <w:pStyle w:val="Cmsor2"/>
+        <w:pStyle w:val="Heading2"/>
         <w:numPr>
           <w:ilvl w:val="1"/>
           <w:numId w:val="3"/>
@@ -8603,7 +8567,7 @@
     </w:p>
     <w:p>
       <w:pPr>
-        <w:pStyle w:val="Cmsor2"/>
+        <w:pStyle w:val="Heading2"/>
         <w:numPr>
           <w:ilvl w:val="2"/>
           <w:numId w:val="3"/>
@@ -8646,7 +8610,7 @@
       <w:hyperlink r:id="rId12" w:history="1">
         <w:r>
           <w:rPr>
-            <w:rStyle w:val="Hiperhivatkozs"/>
+            <w:rStyle w:val="Hyperlink"/>
           </w:rPr>
           <w:t>hibalista.xsd</w:t>
         </w:r>
@@ -8699,7 +8663,7 @@
     </w:p>
     <w:p>
       <w:pPr>
-        <w:pStyle w:val="Listaszerbekezds"/>
+        <w:pStyle w:val="ListParagraph"/>
         <w:ind w:left="360"/>
       </w:pPr>
       <w:r>
@@ -8745,13 +8709,13 @@
     </w:p>
     <w:p>
       <w:pPr>
-        <w:pStyle w:val="Listaszerbekezds"/>
+        <w:pStyle w:val="ListParagraph"/>
         <w:ind w:left="360"/>
       </w:pPr>
     </w:p>
     <w:p>
       <w:pPr>
-        <w:pStyle w:val="Listaszerbekezds"/>
+        <w:pStyle w:val="ListParagraph"/>
         <w:ind w:left="360"/>
       </w:pPr>
       <w:r>
@@ -8760,7 +8724,7 @@
     </w:p>
     <w:p>
       <w:pPr>
-        <w:pStyle w:val="Listaszerbekezds"/>
+        <w:pStyle w:val="ListParagraph"/>
         <w:ind w:left="360"/>
       </w:pPr>
       <w:r>
@@ -8806,13 +8770,13 @@
     </w:p>
     <w:p>
       <w:pPr>
-        <w:pStyle w:val="Listaszerbekezds"/>
+        <w:pStyle w:val="ListParagraph"/>
         <w:ind w:left="360"/>
       </w:pPr>
     </w:p>
     <w:p>
       <w:pPr>
-        <w:pStyle w:val="Listaszerbekezds"/>
+        <w:pStyle w:val="ListParagraph"/>
         <w:ind w:left="360"/>
       </w:pPr>
       <w:r>
@@ -8832,7 +8796,7 @@
     </w:p>
     <w:p>
       <w:pPr>
-        <w:pStyle w:val="Listaszerbekezds"/>
+        <w:pStyle w:val="ListParagraph"/>
         <w:ind w:left="360"/>
       </w:pPr>
       <w:r>
@@ -8879,13 +8843,13 @@
     </w:p>
     <w:p>
       <w:pPr>
-        <w:pStyle w:val="Listaszerbekezds"/>
+        <w:pStyle w:val="ListParagraph"/>
         <w:ind w:left="360"/>
       </w:pPr>
     </w:p>
     <w:p>
       <w:pPr>
-        <w:pStyle w:val="Listaszerbekezds"/>
+        <w:pStyle w:val="ListParagraph"/>
         <w:ind w:left="360"/>
       </w:pPr>
       <w:r>
@@ -8897,7 +8861,7 @@
     </w:p>
     <w:p>
       <w:pPr>
-        <w:pStyle w:val="Listaszerbekezds"/>
+        <w:pStyle w:val="ListParagraph"/>
         <w:ind w:left="360"/>
       </w:pPr>
       <w:r>
@@ -8945,7 +8909,7 @@
     <w:p/>
     <w:p>
       <w:pPr>
-        <w:pStyle w:val="Cmsor2"/>
+        <w:pStyle w:val="Heading2"/>
         <w:numPr>
           <w:ilvl w:val="1"/>
           <w:numId w:val="3"/>
@@ -8963,7 +8927,7 @@
     </w:p>
     <w:tbl>
       <w:tblPr>
-        <w:tblStyle w:val="Rcsostblzat"/>
+        <w:tblStyle w:val="TableGrid0"/>
         <w:tblW w:w="0" w:type="auto"/>
         <w:shd w:val="clear" w:color="auto" w:fill="D9D9D9" w:themeFill="background1" w:themeFillShade="D9"/>
         <w:tblLook w:val="04A0" w:firstRow="1" w:lastRow="0" w:firstColumn="1" w:lastColumn="0" w:noHBand="0" w:noVBand="1"/>
@@ -9133,7 +9097,7 @@
             <w:hyperlink r:id="rId17" w:history="1">
               <w:r>
                 <w:rPr>
-                  <w:rStyle w:val="Hiperhivatkozs"/>
+                  <w:rStyle w:val="Hyperlink"/>
                 </w:rPr>
                 <w:t>https://app.swaggerhub.com/apis/NAVGOVHU/NavM2mBizonylat/1.0#/BizonylatService</w:t>
               </w:r>
@@ -9188,7 +9152,7 @@
     <w:p/>
     <w:p>
       <w:pPr>
-        <w:pStyle w:val="Cmsor2"/>
+        <w:pStyle w:val="Heading2"/>
         <w:numPr>
           <w:ilvl w:val="2"/>
           <w:numId w:val="3"/>
@@ -9249,7 +9213,7 @@
     </w:p>
     <w:tbl>
       <w:tblPr>
-        <w:tblStyle w:val="Rcsostblzat"/>
+        <w:tblStyle w:val="TableGrid0"/>
         <w:tblW w:w="0" w:type="auto"/>
         <w:shd w:val="clear" w:color="auto" w:fill="D9D9D9" w:themeFill="background1" w:themeFillShade="D9"/>
         <w:tblLook w:val="04A0" w:firstRow="1" w:lastRow="0" w:firstColumn="1" w:lastColumn="0" w:noHBand="0" w:noVBand="1"/>
@@ -9427,21 +9391,9 @@
             <w:hyperlink r:id="rId18" w:history="1">
               <w:r>
                 <w:rPr>
-                  <w:rStyle w:val="Hiperhivatkozs"/>
+                  <w:rStyle w:val="Hyperlink"/>
                 </w:rPr>
-                <w:t>https://app.swaggerhub.com/apis/NA</w:t>
-              </w:r>
-              <w:r>
-                <w:rPr>
-                  <w:rStyle w:val="Hiperhivatkozs"/>
-                </w:rPr>
-                <w:t>V</w:t>
-              </w:r>
-              <w:r>
-                <w:rPr>
-                  <w:rStyle w:val="Hiperhivatkozs"/>
-                </w:rPr>
-                <w:t>GOVHU/NavM2mBizonylat/1.0#/BizonylatService/createKalkulacio</w:t>
+                <w:t>https://app.swaggerhub.com/apis/NAVGOVHU/NavM2mBizonylat/1.0#/BizonylatService/createKalkulacio</w:t>
               </w:r>
             </w:hyperlink>
           </w:p>
@@ -9559,7 +9511,7 @@
     </w:p>
     <w:tbl>
       <w:tblPr>
-        <w:tblStyle w:val="Rcsostblzat"/>
+        <w:tblStyle w:val="TableGrid0"/>
         <w:tblW w:w="0" w:type="auto"/>
         <w:shd w:val="clear" w:color="auto" w:fill="D9D9D9" w:themeFill="background1" w:themeFillShade="D9"/>
         <w:tblLook w:val="04A0" w:firstRow="1" w:lastRow="0" w:firstColumn="1" w:lastColumn="0" w:noHBand="0" w:noVBand="1"/>
@@ -9773,7 +9725,7 @@
     </w:p>
     <w:tbl>
       <w:tblPr>
-        <w:tblStyle w:val="Rcsostblzat"/>
+        <w:tblStyle w:val="TableGrid0"/>
         <w:tblW w:w="9067" w:type="dxa"/>
         <w:shd w:val="clear" w:color="auto" w:fill="D9D9D9" w:themeFill="background1" w:themeFillShade="D9"/>
         <w:tblLook w:val="04A0" w:firstRow="1" w:lastRow="0" w:firstColumn="1" w:lastColumn="0" w:noHBand="0" w:noVBand="1"/>
@@ -10220,7 +10172,7 @@
     </w:p>
     <w:tbl>
       <w:tblPr>
-        <w:tblStyle w:val="Rcsostblzat"/>
+        <w:tblStyle w:val="TableGrid0"/>
         <w:tblW w:w="8505" w:type="dxa"/>
         <w:tblInd w:w="-5" w:type="dxa"/>
         <w:shd w:val="clear" w:color="auto" w:fill="D9D9D9" w:themeFill="background1" w:themeFillShade="D9"/>
@@ -10417,15 +10369,7 @@
               <w:jc w:val="center"/>
             </w:pPr>
             <w:r>
-              <w:t>[A-Za-z0-9.\-</w:t>
-            </w:r>
-            <w:proofErr w:type="gramStart"/>
-            <w:r>
-              <w:t>_]{</w:t>
-            </w:r>
-            <w:proofErr w:type="gramEnd"/>
-            <w:r>
-              <w:t>1,10}</w:t>
+              <w:t>[A-Za-z0-9.\-_]{1,10}</w:t>
             </w:r>
           </w:p>
         </w:tc>
@@ -10481,14 +10425,12 @@
             <w:pPr>
               <w:jc w:val="center"/>
             </w:pPr>
-            <w:proofErr w:type="gramStart"/>
             <w:r>
               <w:t>.</w:t>
             </w:r>
             <w:r>
               <w:t>{</w:t>
             </w:r>
-            <w:proofErr w:type="gramEnd"/>
             <w:r>
               <w:t>44-64}</w:t>
             </w:r>
@@ -10546,7 +10488,7 @@
     </w:p>
     <w:tbl>
       <w:tblPr>
-        <w:tblStyle w:val="Rcsostblzat"/>
+        <w:tblStyle w:val="TableGrid0"/>
         <w:tblW w:w="9067" w:type="dxa"/>
         <w:shd w:val="clear" w:color="auto" w:fill="D9D9D9" w:themeFill="background1" w:themeFillShade="D9"/>
         <w:tblLook w:val="04A0" w:firstRow="1" w:lastRow="0" w:firstColumn="1" w:lastColumn="0" w:noHBand="0" w:noVBand="1"/>
@@ -11145,7 +11087,7 @@
     </w:p>
     <w:tbl>
       <w:tblPr>
-        <w:tblStyle w:val="Rcsostblzat"/>
+        <w:tblStyle w:val="TableGrid0"/>
         <w:tblW w:w="9067" w:type="dxa"/>
         <w:shd w:val="clear" w:color="auto" w:fill="D9D9D9" w:themeFill="background1" w:themeFillShade="D9"/>
         <w:tblLook w:val="04A0" w:firstRow="1" w:lastRow="0" w:firstColumn="1" w:lastColumn="0" w:noHBand="0" w:noVBand="1"/>
@@ -11552,7 +11494,7 @@
     </w:p>
     <w:tbl>
       <w:tblPr>
-        <w:tblStyle w:val="Rcsostblzat"/>
+        <w:tblStyle w:val="TableGrid0"/>
         <w:tblW w:w="0" w:type="auto"/>
         <w:shd w:val="clear" w:color="auto" w:fill="D9D9D9" w:themeFill="background1" w:themeFillShade="D9"/>
         <w:tblLook w:val="04A0" w:firstRow="1" w:lastRow="0" w:firstColumn="1" w:lastColumn="0" w:noHBand="0" w:noVBand="1"/>
@@ -11781,7 +11723,7 @@
     </w:p>
     <w:tbl>
       <w:tblPr>
-        <w:tblStyle w:val="Rcsostblzat"/>
+        <w:tblStyle w:val="TableGrid0"/>
         <w:tblW w:w="0" w:type="auto"/>
         <w:shd w:val="clear" w:color="auto" w:fill="D9D9D9" w:themeFill="background1" w:themeFillShade="D9"/>
         <w:tblLook w:val="04A0" w:firstRow="1" w:lastRow="0" w:firstColumn="1" w:lastColumn="0" w:noHBand="0" w:noVBand="1"/>
@@ -12208,7 +12150,7 @@
     <w:p/>
     <w:p>
       <w:pPr>
-        <w:pStyle w:val="Cmsor2"/>
+        <w:pStyle w:val="Heading2"/>
         <w:numPr>
           <w:ilvl w:val="2"/>
           <w:numId w:val="3"/>
@@ -12251,7 +12193,7 @@
     </w:p>
     <w:tbl>
       <w:tblPr>
-        <w:tblStyle w:val="Rcsostblzat"/>
+        <w:tblStyle w:val="TableGrid0"/>
         <w:tblW w:w="0" w:type="auto"/>
         <w:shd w:val="clear" w:color="auto" w:fill="D9D9D9" w:themeFill="background1" w:themeFillShade="D9"/>
         <w:tblLook w:val="04A0" w:firstRow="1" w:lastRow="0" w:firstColumn="1" w:lastColumn="0" w:noHBand="0" w:noVBand="1"/>
@@ -12421,7 +12363,7 @@
             <w:hyperlink r:id="rId19" w:history="1">
               <w:r>
                 <w:rPr>
-                  <w:rStyle w:val="Hiperhivatkozs"/>
+                  <w:rStyle w:val="Hyperlink"/>
                 </w:rPr>
                 <w:t>https://app.swaggerhub.com/apis/NAVGOVHU/NavM2mBizonylat/1.0#/BizonylatService/getKalkulacio</w:t>
               </w:r>
@@ -12503,7 +12445,7 @@
     </w:p>
     <w:tbl>
       <w:tblPr>
-        <w:tblStyle w:val="Rcsostblzat"/>
+        <w:tblStyle w:val="TableGrid0"/>
         <w:tblW w:w="0" w:type="auto"/>
         <w:shd w:val="clear" w:color="auto" w:fill="D9D9D9" w:themeFill="background1" w:themeFillShade="D9"/>
         <w:tblLook w:val="04A0" w:firstRow="1" w:lastRow="0" w:firstColumn="1" w:lastColumn="0" w:noHBand="0" w:noVBand="1"/>
@@ -12748,7 +12690,7 @@
     </w:p>
     <w:tbl>
       <w:tblPr>
-        <w:tblStyle w:val="Rcsostblzat"/>
+        <w:tblStyle w:val="TableGrid0"/>
         <w:tblW w:w="9067" w:type="dxa"/>
         <w:shd w:val="clear" w:color="auto" w:fill="D9D9D9" w:themeFill="background1" w:themeFillShade="D9"/>
         <w:tblLook w:val="04A0" w:firstRow="1" w:lastRow="0" w:firstColumn="1" w:lastColumn="0" w:noHBand="0" w:noVBand="1"/>
@@ -12972,15 +12914,7 @@
               <w:jc w:val="both"/>
             </w:pPr>
             <w:r>
-              <w:t xml:space="preserve">A kalkulált számított </w:t>
-            </w:r>
-            <w:proofErr w:type="gramStart"/>
-            <w:r>
-              <w:t>mezőket  tartalmazóbizonylat</w:t>
-            </w:r>
-            <w:proofErr w:type="gramEnd"/>
-            <w:r>
-              <w:t xml:space="preserve"> file </w:t>
+              <w:t xml:space="preserve">A kalkulált számított mezőket  tartalmazóbizonylat file </w:t>
             </w:r>
             <w:proofErr w:type="spellStart"/>
             <w:r>
@@ -13333,7 +13267,7 @@
     </w:p>
     <w:tbl>
       <w:tblPr>
-        <w:tblStyle w:val="Rcsostblzat"/>
+        <w:tblStyle w:val="TableGrid0"/>
         <w:tblW w:w="0" w:type="auto"/>
         <w:shd w:val="clear" w:color="auto" w:fill="D9D9D9" w:themeFill="background1" w:themeFillShade="D9"/>
         <w:tblLook w:val="04A0" w:firstRow="1" w:lastRow="0" w:firstColumn="1" w:lastColumn="0" w:noHBand="0" w:noVBand="1"/>
@@ -13430,7 +13364,7 @@
     </w:p>
     <w:p>
       <w:pPr>
-        <w:pStyle w:val="Cmsor2"/>
+        <w:pStyle w:val="Heading2"/>
         <w:numPr>
           <w:ilvl w:val="2"/>
           <w:numId w:val="3"/>
@@ -13473,7 +13407,7 @@
     </w:p>
     <w:tbl>
       <w:tblPr>
-        <w:tblStyle w:val="Rcsostblzat"/>
+        <w:tblStyle w:val="TableGrid0"/>
         <w:tblW w:w="0" w:type="auto"/>
         <w:shd w:val="clear" w:color="auto" w:fill="D9D9D9" w:themeFill="background1" w:themeFillShade="D9"/>
         <w:tblLook w:val="04A0" w:firstRow="1" w:lastRow="0" w:firstColumn="1" w:lastColumn="0" w:noHBand="0" w:noVBand="1"/>
@@ -13648,7 +13582,7 @@
             <w:hyperlink r:id="rId20" w:history="1">
               <w:r>
                 <w:rPr>
-                  <w:rStyle w:val="Hiperhivatkozs"/>
+                  <w:rStyle w:val="Hyperlink"/>
                 </w:rPr>
                 <w:t>https://app.swaggerhub.com/apis/NAVGOVHU/NavM2mBizonylat/1.0#/BizonylatService/createValidacio</w:t>
               </w:r>
@@ -13824,7 +13758,7 @@
     </w:p>
     <w:tbl>
       <w:tblPr>
-        <w:tblStyle w:val="Rcsostblzat"/>
+        <w:tblStyle w:val="TableGrid0"/>
         <w:tblW w:w="0" w:type="auto"/>
         <w:shd w:val="clear" w:color="auto" w:fill="D9D9D9" w:themeFill="background1" w:themeFillShade="D9"/>
         <w:tblLook w:val="04A0" w:firstRow="1" w:lastRow="0" w:firstColumn="1" w:lastColumn="0" w:noHBand="0" w:noVBand="1"/>
@@ -14048,7 +13982,7 @@
     </w:p>
     <w:tbl>
       <w:tblPr>
-        <w:tblStyle w:val="Rcsostblzat"/>
+        <w:tblStyle w:val="TableGrid0"/>
         <w:tblW w:w="9067" w:type="dxa"/>
         <w:shd w:val="clear" w:color="auto" w:fill="D9D9D9" w:themeFill="background1" w:themeFillShade="D9"/>
         <w:tblLook w:val="04A0" w:firstRow="1" w:lastRow="0" w:firstColumn="1" w:lastColumn="0" w:noHBand="0" w:noVBand="1"/>
@@ -14494,7 +14428,7 @@
     </w:p>
     <w:tbl>
       <w:tblPr>
-        <w:tblStyle w:val="Rcsostblzat"/>
+        <w:tblStyle w:val="TableGrid0"/>
         <w:tblW w:w="8505" w:type="dxa"/>
         <w:tblInd w:w="-5" w:type="dxa"/>
         <w:shd w:val="clear" w:color="auto" w:fill="D9D9D9" w:themeFill="background1" w:themeFillShade="D9"/>
@@ -14691,15 +14625,7 @@
               <w:jc w:val="center"/>
             </w:pPr>
             <w:r>
-              <w:t>[A-Za-z0-9.\-</w:t>
-            </w:r>
-            <w:proofErr w:type="gramStart"/>
-            <w:r>
-              <w:t>_]{</w:t>
-            </w:r>
-            <w:proofErr w:type="gramEnd"/>
-            <w:r>
-              <w:t>1,10}</w:t>
+              <w:t>[A-Za-z0-9.\-_]{1,10}</w:t>
             </w:r>
           </w:p>
         </w:tc>
@@ -14755,14 +14681,12 @@
             <w:pPr>
               <w:jc w:val="center"/>
             </w:pPr>
-            <w:proofErr w:type="gramStart"/>
             <w:r>
               <w:t>.</w:t>
             </w:r>
             <w:r>
               <w:t>{</w:t>
             </w:r>
-            <w:proofErr w:type="gramEnd"/>
             <w:r>
               <w:t>44-64}</w:t>
             </w:r>
@@ -14823,7 +14747,7 @@
     </w:p>
     <w:tbl>
       <w:tblPr>
-        <w:tblStyle w:val="Rcsostblzat"/>
+        <w:tblStyle w:val="TableGrid0"/>
         <w:tblW w:w="9067" w:type="dxa"/>
         <w:shd w:val="clear" w:color="auto" w:fill="D9D9D9" w:themeFill="background1" w:themeFillShade="D9"/>
         <w:tblLook w:val="04A0" w:firstRow="1" w:lastRow="0" w:firstColumn="1" w:lastColumn="0" w:noHBand="0" w:noVBand="1"/>
@@ -15420,7 +15344,7 @@
     </w:p>
     <w:tbl>
       <w:tblPr>
-        <w:tblStyle w:val="Rcsostblzat"/>
+        <w:tblStyle w:val="TableGrid0"/>
         <w:tblW w:w="0" w:type="auto"/>
         <w:shd w:val="clear" w:color="auto" w:fill="D9D9D9" w:themeFill="background1" w:themeFillShade="D9"/>
         <w:tblLook w:val="04A0" w:firstRow="1" w:lastRow="0" w:firstColumn="1" w:lastColumn="0" w:noHBand="0" w:noVBand="1"/>
@@ -15662,7 +15586,7 @@
     </w:p>
     <w:tbl>
       <w:tblPr>
-        <w:tblStyle w:val="Rcsostblzat"/>
+        <w:tblStyle w:val="TableGrid0"/>
         <w:tblW w:w="0" w:type="auto"/>
         <w:shd w:val="clear" w:color="auto" w:fill="D9D9D9" w:themeFill="background1" w:themeFillShade="D9"/>
         <w:tblLook w:val="04A0" w:firstRow="1" w:lastRow="0" w:firstColumn="1" w:lastColumn="0" w:noHBand="0" w:noVBand="1"/>
@@ -16092,7 +16016,7 @@
     <w:p/>
     <w:p>
       <w:pPr>
-        <w:pStyle w:val="Cmsor2"/>
+        <w:pStyle w:val="Heading2"/>
         <w:numPr>
           <w:ilvl w:val="2"/>
           <w:numId w:val="3"/>
@@ -16153,7 +16077,7 @@
     </w:p>
     <w:tbl>
       <w:tblPr>
-        <w:tblStyle w:val="Rcsostblzat"/>
+        <w:tblStyle w:val="TableGrid0"/>
         <w:tblW w:w="0" w:type="auto"/>
         <w:shd w:val="clear" w:color="auto" w:fill="D9D9D9" w:themeFill="background1" w:themeFillShade="D9"/>
         <w:tblLook w:val="04A0" w:firstRow="1" w:lastRow="0" w:firstColumn="1" w:lastColumn="0" w:noHBand="0" w:noVBand="1"/>
@@ -16333,7 +16257,7 @@
             <w:hyperlink r:id="rId21" w:history="1">
               <w:r>
                 <w:rPr>
-                  <w:rStyle w:val="Hiperhivatkozs"/>
+                  <w:rStyle w:val="Hyperlink"/>
                 </w:rPr>
                 <w:t>https://app.swaggerhub.com/apis/NAVGOVHU/NavM2mBizonylat/1.0#/BizonylatService/getValidacio</w:t>
               </w:r>
@@ -16415,7 +16339,7 @@
     </w:p>
     <w:tbl>
       <w:tblPr>
-        <w:tblStyle w:val="Rcsostblzat"/>
+        <w:tblStyle w:val="TableGrid0"/>
         <w:tblW w:w="0" w:type="auto"/>
         <w:shd w:val="clear" w:color="auto" w:fill="D9D9D9" w:themeFill="background1" w:themeFillShade="D9"/>
         <w:tblLook w:val="04A0" w:firstRow="1" w:lastRow="0" w:firstColumn="1" w:lastColumn="0" w:noHBand="0" w:noVBand="1"/>
@@ -16674,7 +16598,7 @@
     </w:p>
     <w:tbl>
       <w:tblPr>
-        <w:tblStyle w:val="Rcsostblzat"/>
+        <w:tblStyle w:val="TableGrid0"/>
         <w:tblW w:w="9067" w:type="dxa"/>
         <w:shd w:val="clear" w:color="auto" w:fill="D9D9D9" w:themeFill="background1" w:themeFillShade="D9"/>
         <w:tblLook w:val="04A0" w:firstRow="1" w:lastRow="0" w:firstColumn="1" w:lastColumn="0" w:noHBand="0" w:noVBand="1"/>
@@ -17213,7 +17137,7 @@
     </w:p>
     <w:tbl>
       <w:tblPr>
-        <w:tblStyle w:val="Rcsostblzat"/>
+        <w:tblStyle w:val="TableGrid0"/>
         <w:tblW w:w="0" w:type="auto"/>
         <w:shd w:val="clear" w:color="auto" w:fill="D9D9D9" w:themeFill="background1" w:themeFillShade="D9"/>
         <w:tblLook w:val="04A0" w:firstRow="1" w:lastRow="0" w:firstColumn="1" w:lastColumn="0" w:noHBand="0" w:noVBand="1"/>
@@ -17310,7 +17234,7 @@
     </w:p>
     <w:p>
       <w:pPr>
-        <w:pStyle w:val="Cmsor2"/>
+        <w:pStyle w:val="Heading2"/>
         <w:numPr>
           <w:ilvl w:val="2"/>
           <w:numId w:val="3"/>
@@ -17354,7 +17278,7 @@
     </w:p>
     <w:tbl>
       <w:tblPr>
-        <w:tblStyle w:val="Rcsostblzat"/>
+        <w:tblStyle w:val="TableGrid0"/>
         <w:tblW w:w="0" w:type="auto"/>
         <w:shd w:val="clear" w:color="auto" w:fill="D9D9D9" w:themeFill="background1" w:themeFillShade="D9"/>
         <w:tblLook w:val="04A0" w:firstRow="1" w:lastRow="0" w:firstColumn="1" w:lastColumn="0" w:noHBand="0" w:noVBand="1"/>
@@ -17527,7 +17451,7 @@
             <w:hyperlink r:id="rId22" w:history="1">
               <w:r>
                 <w:rPr>
-                  <w:rStyle w:val="Hiperhivatkozs"/>
+                  <w:rStyle w:val="Hyperlink"/>
                 </w:rPr>
                 <w:t>https://app.swaggerhub.com/apis/NAVGOVHU/NavM2mBizonylat/1.0#/BizonylatService/createBizonylat</w:t>
               </w:r>
@@ -17710,7 +17634,7 @@
     </w:p>
     <w:tbl>
       <w:tblPr>
-        <w:tblStyle w:val="Rcsostblzat"/>
+        <w:tblStyle w:val="TableGrid0"/>
         <w:tblW w:w="0" w:type="auto"/>
         <w:shd w:val="clear" w:color="auto" w:fill="D9D9D9" w:themeFill="background1" w:themeFillShade="D9"/>
         <w:tblLook w:val="04A0" w:firstRow="1" w:lastRow="0" w:firstColumn="1" w:lastColumn="0" w:noHBand="0" w:noVBand="1"/>
@@ -17936,7 +17860,7 @@
     </w:p>
     <w:tbl>
       <w:tblPr>
-        <w:tblStyle w:val="Rcsostblzat"/>
+        <w:tblStyle w:val="TableGrid0"/>
         <w:tblW w:w="9067" w:type="dxa"/>
         <w:shd w:val="clear" w:color="auto" w:fill="D9D9D9" w:themeFill="background1" w:themeFillShade="D9"/>
         <w:tblLook w:val="04A0" w:firstRow="1" w:lastRow="0" w:firstColumn="1" w:lastColumn="0" w:noHBand="0" w:noVBand="1"/>
@@ -18571,7 +18495,7 @@
     </w:p>
     <w:tbl>
       <w:tblPr>
-        <w:tblStyle w:val="Rcsostblzat"/>
+        <w:tblStyle w:val="TableGrid0"/>
         <w:tblW w:w="8505" w:type="dxa"/>
         <w:tblInd w:w="-5" w:type="dxa"/>
         <w:shd w:val="clear" w:color="auto" w:fill="D9D9D9" w:themeFill="background1" w:themeFillShade="D9"/>
@@ -18768,15 +18692,7 @@
               <w:jc w:val="center"/>
             </w:pPr>
             <w:r>
-              <w:t>[A-Za-z0-9.\-</w:t>
-            </w:r>
-            <w:proofErr w:type="gramStart"/>
-            <w:r>
-              <w:t>_]{</w:t>
-            </w:r>
-            <w:proofErr w:type="gramEnd"/>
-            <w:r>
-              <w:t>1,10}</w:t>
+              <w:t>[A-Za-z0-9.\-_]{1,10}</w:t>
             </w:r>
           </w:p>
         </w:tc>
@@ -18883,14 +18799,12 @@
             <w:pPr>
               <w:jc w:val="center"/>
             </w:pPr>
-            <w:proofErr w:type="gramStart"/>
             <w:r>
               <w:t>.</w:t>
             </w:r>
             <w:r>
               <w:t>{</w:t>
             </w:r>
-            <w:proofErr w:type="gramEnd"/>
             <w:r>
               <w:t>44-64}</w:t>
             </w:r>
@@ -18951,7 +18865,7 @@
     </w:p>
     <w:tbl>
       <w:tblPr>
-        <w:tblStyle w:val="Rcsostblzat"/>
+        <w:tblStyle w:val="TableGrid0"/>
         <w:tblW w:w="9067" w:type="dxa"/>
         <w:shd w:val="clear" w:color="auto" w:fill="D9D9D9" w:themeFill="background1" w:themeFillShade="D9"/>
         <w:tblLook w:val="04A0" w:firstRow="1" w:lastRow="0" w:firstColumn="1" w:lastColumn="0" w:noHBand="0" w:noVBand="1"/>
@@ -19542,7 +19456,7 @@
     </w:p>
     <w:tbl>
       <w:tblPr>
-        <w:tblStyle w:val="Rcsostblzat"/>
+        <w:tblStyle w:val="TableGrid0"/>
         <w:tblW w:w="0" w:type="auto"/>
         <w:shd w:val="clear" w:color="auto" w:fill="D9D9D9" w:themeFill="background1" w:themeFillShade="D9"/>
         <w:tblLook w:val="04A0" w:firstRow="1" w:lastRow="0" w:firstColumn="1" w:lastColumn="0" w:noHBand="0" w:noVBand="1"/>
@@ -19772,7 +19686,7 @@
     </w:p>
     <w:tbl>
       <w:tblPr>
-        <w:tblStyle w:val="Rcsostblzat"/>
+        <w:tblStyle w:val="TableGrid0"/>
         <w:tblW w:w="0" w:type="auto"/>
         <w:shd w:val="clear" w:color="auto" w:fill="D9D9D9" w:themeFill="background1" w:themeFillShade="D9"/>
         <w:tblLook w:val="04A0" w:firstRow="1" w:lastRow="0" w:firstColumn="1" w:lastColumn="0" w:noHBand="0" w:noVBand="1"/>
@@ -20188,15 +20102,7 @@
               <w:spacing w:after="80"/>
             </w:pPr>
             <w:r>
-              <w:t xml:space="preserve">A bizonylattípus </w:t>
-            </w:r>
-            <w:proofErr w:type="gramStart"/>
-            <w:r>
-              <w:t>beküldése  az</w:t>
-            </w:r>
-            <w:proofErr w:type="gramEnd"/>
-            <w:r>
-              <w:t xml:space="preserve"> ÜPO regisztrációsfelületen megadott beállítások alapján nem engedélyezett.</w:t>
+              <w:t>A bizonylattípus beküldése  az ÜPO regisztrációsfelületen megadott beállítások alapján nem engedélyezett.</w:t>
             </w:r>
           </w:p>
         </w:tc>
@@ -20498,7 +20404,7 @@
     <w:p/>
     <w:p>
       <w:pPr>
-        <w:pStyle w:val="Cmsor2"/>
+        <w:pStyle w:val="Heading2"/>
         <w:numPr>
           <w:ilvl w:val="2"/>
           <w:numId w:val="3"/>
@@ -20542,7 +20448,7 @@
     </w:p>
     <w:tbl>
       <w:tblPr>
-        <w:tblStyle w:val="Rcsostblzat"/>
+        <w:tblStyle w:val="TableGrid0"/>
         <w:tblW w:w="0" w:type="auto"/>
         <w:shd w:val="clear" w:color="auto" w:fill="D9D9D9" w:themeFill="background1" w:themeFillShade="D9"/>
         <w:tblLook w:val="04A0" w:firstRow="1" w:lastRow="0" w:firstColumn="1" w:lastColumn="0" w:noHBand="0" w:noVBand="1"/>
@@ -20710,7 +20616,7 @@
             <w:hyperlink r:id="rId23" w:history="1">
               <w:r>
                 <w:rPr>
-                  <w:rStyle w:val="Hiperhivatkozs"/>
+                  <w:rStyle w:val="Hyperlink"/>
                 </w:rPr>
                 <w:t>https://app.swaggerhub.com/apis/NAVGOVHU/NavM2mBizonylat/1.0#/BizonylatService/getBizonylat</w:t>
               </w:r>
@@ -20828,7 +20734,7 @@
     </w:p>
     <w:tbl>
       <w:tblPr>
-        <w:tblStyle w:val="Rcsostblzat"/>
+        <w:tblStyle w:val="TableGrid0"/>
         <w:tblW w:w="0" w:type="auto"/>
         <w:shd w:val="clear" w:color="auto" w:fill="D9D9D9" w:themeFill="background1" w:themeFillShade="D9"/>
         <w:tblLook w:val="04A0" w:firstRow="1" w:lastRow="0" w:firstColumn="1" w:lastColumn="0" w:noHBand="0" w:noVBand="1"/>
@@ -21084,7 +20990,7 @@
     </w:p>
     <w:tbl>
       <w:tblPr>
-        <w:tblStyle w:val="Rcsostblzat"/>
+        <w:tblStyle w:val="TableGrid0"/>
         <w:tblW w:w="9067" w:type="dxa"/>
         <w:shd w:val="clear" w:color="auto" w:fill="D9D9D9" w:themeFill="background1" w:themeFillShade="D9"/>
         <w:tblLook w:val="04A0" w:firstRow="1" w:lastRow="0" w:firstColumn="1" w:lastColumn="0" w:noHBand="0" w:noVBand="1"/>
@@ -21619,7 +21525,7 @@
     </w:p>
     <w:tbl>
       <w:tblPr>
-        <w:tblStyle w:val="Rcsostblzat"/>
+        <w:tblStyle w:val="TableGrid0"/>
         <w:tblW w:w="0" w:type="auto"/>
         <w:shd w:val="clear" w:color="auto" w:fill="D9D9D9" w:themeFill="background1" w:themeFillShade="D9"/>
         <w:tblLook w:val="04A0" w:firstRow="1" w:lastRow="0" w:firstColumn="1" w:lastColumn="0" w:noHBand="0" w:noVBand="1"/>
@@ -21716,7 +21622,7 @@
     </w:p>
     <w:p>
       <w:pPr>
-        <w:pStyle w:val="Cmsor1"/>
+        <w:pStyle w:val="Heading1"/>
         <w:numPr>
           <w:ilvl w:val="0"/>
           <w:numId w:val="3"/>
@@ -21731,7 +21637,7 @@
     </w:p>
     <w:p>
       <w:pPr>
-        <w:pStyle w:val="Cmsor2"/>
+        <w:pStyle w:val="Heading2"/>
         <w:numPr>
           <w:ilvl w:val="1"/>
           <w:numId w:val="3"/>
@@ -21787,19 +21693,17 @@
         <w:t xml:space="preserve"> helyett SOAP </w:t>
       </w:r>
       <w:proofErr w:type="spellStart"/>
-      <w:proofErr w:type="gramStart"/>
       <w:r>
         <w:t>xs:string</w:t>
       </w:r>
       <w:proofErr w:type="spellEnd"/>
-      <w:proofErr w:type="gramEnd"/>
       <w:r>
         <w:t>.</w:t>
       </w:r>
     </w:p>
     <w:p>
       <w:pPr>
-        <w:pStyle w:val="Cmsor2"/>
+        <w:pStyle w:val="Heading2"/>
         <w:numPr>
           <w:ilvl w:val="2"/>
           <w:numId w:val="3"/>
@@ -21907,7 +21811,7 @@
     </w:p>
     <w:tbl>
       <w:tblPr>
-        <w:tblStyle w:val="Rcsostblzat"/>
+        <w:tblStyle w:val="TableGrid0"/>
         <w:tblW w:w="0" w:type="auto"/>
         <w:shd w:val="clear" w:color="auto" w:fill="D9D9D9" w:themeFill="background1" w:themeFillShade="D9"/>
         <w:tblLook w:val="04A0" w:firstRow="1" w:lastRow="0" w:firstColumn="1" w:lastColumn="0" w:noHBand="0" w:noVBand="1"/>
@@ -22032,12 +21936,10 @@
               <w:jc w:val="center"/>
             </w:pPr>
             <w:proofErr w:type="spellStart"/>
-            <w:proofErr w:type="gramStart"/>
             <w:r>
               <w:t>xs:string</w:t>
             </w:r>
             <w:proofErr w:type="spellEnd"/>
-            <w:proofErr w:type="gramEnd"/>
           </w:p>
         </w:tc>
         <w:tc>
@@ -22090,12 +21992,10 @@
               <w:jc w:val="center"/>
             </w:pPr>
             <w:proofErr w:type="spellStart"/>
-            <w:proofErr w:type="gramStart"/>
             <w:r>
               <w:t>xs:string</w:t>
             </w:r>
             <w:proofErr w:type="spellEnd"/>
-            <w:proofErr w:type="gramEnd"/>
           </w:p>
         </w:tc>
         <w:tc>
@@ -22157,7 +22057,7 @@
     </w:p>
     <w:tbl>
       <w:tblPr>
-        <w:tblStyle w:val="Rcsostblzat"/>
+        <w:tblStyle w:val="TableGrid0"/>
         <w:tblW w:w="0" w:type="auto"/>
         <w:shd w:val="clear" w:color="auto" w:fill="D9D9D9" w:themeFill="background1" w:themeFillShade="D9"/>
         <w:tblLook w:val="04A0" w:firstRow="1" w:lastRow="0" w:firstColumn="1" w:lastColumn="0" w:noHBand="0" w:noVBand="1"/>
@@ -22331,7 +22231,7 @@
     <w:p/>
     <w:p>
       <w:pPr>
-        <w:pStyle w:val="Cmsor2"/>
+        <w:pStyle w:val="Heading2"/>
         <w:numPr>
           <w:ilvl w:val="2"/>
           <w:numId w:val="3"/>
@@ -22479,7 +22379,7 @@
     </w:p>
     <w:tbl>
       <w:tblPr>
-        <w:tblStyle w:val="Rcsostblzat"/>
+        <w:tblStyle w:val="TableGrid0"/>
         <w:tblW w:w="0" w:type="auto"/>
         <w:shd w:val="clear" w:color="auto" w:fill="D9D9D9" w:themeFill="background1" w:themeFillShade="D9"/>
         <w:tblLook w:val="04A0" w:firstRow="1" w:lastRow="0" w:firstColumn="1" w:lastColumn="0" w:noHBand="0" w:noVBand="1"/>
@@ -22605,12 +22505,10 @@
               <w:jc w:val="center"/>
             </w:pPr>
             <w:proofErr w:type="spellStart"/>
-            <w:proofErr w:type="gramStart"/>
             <w:r>
               <w:t>xs:string</w:t>
             </w:r>
             <w:proofErr w:type="spellEnd"/>
-            <w:proofErr w:type="gramEnd"/>
           </w:p>
         </w:tc>
         <w:tc>
@@ -22688,7 +22586,7 @@
     <w:p/>
     <w:p>
       <w:pPr>
-        <w:pStyle w:val="Cmsor2"/>
+        <w:pStyle w:val="Heading2"/>
         <w:numPr>
           <w:ilvl w:val="1"/>
           <w:numId w:val="3"/>
@@ -22703,7 +22601,7 @@
     </w:p>
     <w:p>
       <w:pPr>
-        <w:pStyle w:val="Cmsor2"/>
+        <w:pStyle w:val="Heading2"/>
         <w:numPr>
           <w:ilvl w:val="2"/>
           <w:numId w:val="3"/>
@@ -22746,7 +22644,7 @@
     </w:p>
     <w:p>
       <w:pPr>
-        <w:pStyle w:val="Cmsor2"/>
+        <w:pStyle w:val="Heading2"/>
         <w:numPr>
           <w:ilvl w:val="1"/>
           <w:numId w:val="3"/>
@@ -22764,7 +22662,7 @@
     </w:p>
     <w:tbl>
       <w:tblPr>
-        <w:tblStyle w:val="Rcsostblzat"/>
+        <w:tblStyle w:val="TableGrid0"/>
         <w:tblW w:w="0" w:type="auto"/>
         <w:shd w:val="clear" w:color="auto" w:fill="D9D9D9" w:themeFill="background1" w:themeFillShade="D9"/>
         <w:tblLook w:val="04A0" w:firstRow="1" w:lastRow="0" w:firstColumn="1" w:lastColumn="0" w:noHBand="0" w:noVBand="1"/>
@@ -22979,7 +22877,7 @@
     <w:p/>
     <w:p>
       <w:pPr>
-        <w:pStyle w:val="Cmsor2"/>
+        <w:pStyle w:val="Heading2"/>
         <w:numPr>
           <w:ilvl w:val="2"/>
           <w:numId w:val="3"/>
@@ -23152,7 +23050,7 @@
     </w:p>
     <w:tbl>
       <w:tblPr>
-        <w:tblStyle w:val="Rcsostblzat"/>
+        <w:tblStyle w:val="TableGrid0"/>
         <w:tblW w:w="0" w:type="auto"/>
         <w:shd w:val="clear" w:color="auto" w:fill="D9D9D9" w:themeFill="background1" w:themeFillShade="D9"/>
         <w:tblLook w:val="04A0" w:firstRow="1" w:lastRow="0" w:firstColumn="1" w:lastColumn="0" w:noHBand="0" w:noVBand="1"/>
@@ -23421,7 +23319,7 @@
     </w:p>
     <w:p>
       <w:pPr>
-        <w:pStyle w:val="Cmsor2"/>
+        <w:pStyle w:val="Heading2"/>
         <w:numPr>
           <w:ilvl w:val="2"/>
           <w:numId w:val="3"/>
@@ -23464,7 +23362,7 @@
     </w:p>
     <w:tbl>
       <w:tblPr>
-        <w:tblStyle w:val="Rcsostblzat"/>
+        <w:tblStyle w:val="TableGrid0"/>
         <w:tblW w:w="0" w:type="auto"/>
         <w:shd w:val="clear" w:color="auto" w:fill="D9D9D9" w:themeFill="background1" w:themeFillShade="D9"/>
         <w:tblLook w:val="04A0" w:firstRow="1" w:lastRow="0" w:firstColumn="1" w:lastColumn="0" w:noHBand="0" w:noVBand="1"/>
@@ -23703,7 +23601,7 @@
     <w:p/>
     <w:p>
       <w:pPr>
-        <w:pStyle w:val="Cmsor2"/>
+        <w:pStyle w:val="Heading2"/>
         <w:numPr>
           <w:ilvl w:val="2"/>
           <w:numId w:val="3"/>
@@ -23746,7 +23644,7 @@
     </w:p>
     <w:tbl>
       <w:tblPr>
-        <w:tblStyle w:val="Rcsostblzat"/>
+        <w:tblStyle w:val="TableGrid0"/>
         <w:tblW w:w="0" w:type="auto"/>
         <w:shd w:val="clear" w:color="auto" w:fill="D9D9D9" w:themeFill="background1" w:themeFillShade="D9"/>
         <w:tblLook w:val="04A0" w:firstRow="1" w:lastRow="0" w:firstColumn="1" w:lastColumn="0" w:noHBand="0" w:noVBand="1"/>
@@ -24082,7 +23980,7 @@
     </w:p>
     <w:p>
       <w:pPr>
-        <w:pStyle w:val="Cmsor2"/>
+        <w:pStyle w:val="Heading2"/>
         <w:numPr>
           <w:ilvl w:val="2"/>
           <w:numId w:val="3"/>
@@ -24125,7 +24023,7 @@
     </w:p>
     <w:tbl>
       <w:tblPr>
-        <w:tblStyle w:val="Rcsostblzat"/>
+        <w:tblStyle w:val="TableGrid0"/>
         <w:tblW w:w="0" w:type="auto"/>
         <w:shd w:val="clear" w:color="auto" w:fill="D9D9D9" w:themeFill="background1" w:themeFillShade="D9"/>
         <w:tblLook w:val="04A0" w:firstRow="1" w:lastRow="0" w:firstColumn="1" w:lastColumn="0" w:noHBand="0" w:noVBand="1"/>
@@ -24343,7 +24241,7 @@
     </w:p>
     <w:p>
       <w:pPr>
-        <w:pStyle w:val="Cmsor2"/>
+        <w:pStyle w:val="Heading2"/>
         <w:numPr>
           <w:ilvl w:val="2"/>
           <w:numId w:val="3"/>
@@ -24386,7 +24284,7 @@
     </w:p>
     <w:tbl>
       <w:tblPr>
-        <w:tblStyle w:val="Rcsostblzat"/>
+        <w:tblStyle w:val="TableGrid0"/>
         <w:tblW w:w="0" w:type="auto"/>
         <w:shd w:val="clear" w:color="auto" w:fill="D9D9D9" w:themeFill="background1" w:themeFillShade="D9"/>
         <w:tblLook w:val="04A0" w:firstRow="1" w:lastRow="0" w:firstColumn="1" w:lastColumn="0" w:noHBand="0" w:noVBand="1"/>
@@ -24715,7 +24613,7 @@
     </w:p>
     <w:p>
       <w:pPr>
-        <w:pStyle w:val="Cmsor2"/>
+        <w:pStyle w:val="Heading2"/>
         <w:numPr>
           <w:ilvl w:val="2"/>
           <w:numId w:val="3"/>
@@ -24758,7 +24656,7 @@
     </w:p>
     <w:tbl>
       <w:tblPr>
-        <w:tblStyle w:val="Rcsostblzat"/>
+        <w:tblStyle w:val="TableGrid0"/>
         <w:tblW w:w="0" w:type="auto"/>
         <w:shd w:val="clear" w:color="auto" w:fill="D9D9D9" w:themeFill="background1" w:themeFillShade="D9"/>
         <w:tblLook w:val="04A0" w:firstRow="1" w:lastRow="0" w:firstColumn="1" w:lastColumn="0" w:noHBand="0" w:noVBand="1"/>
@@ -25042,7 +24940,7 @@
     </w:p>
     <w:p>
       <w:pPr>
-        <w:pStyle w:val="Cmsor1"/>
+        <w:pStyle w:val="Heading1"/>
         <w:numPr>
           <w:ilvl w:val="0"/>
           <w:numId w:val="3"/>
@@ -26207,7 +26105,7 @@
     <w:lvl w:ilvl="0" w:tplc="B1161F7E">
       <w:start w:val="1"/>
       <w:numFmt w:val="decimal"/>
-      <w:pStyle w:val="Cmsor1"/>
+      <w:pStyle w:val="Heading1"/>
       <w:lvlText w:val="%1."/>
       <w:lvlJc w:val="left"/>
       <w:pPr>
@@ -26493,7 +26391,7 @@
     <w:lvl w:ilvl="0" w:tplc="5B4E501C">
       <w:start w:val="1"/>
       <w:numFmt w:val="decimal"/>
-      <w:pStyle w:val="Cmsor2"/>
+      <w:pStyle w:val="Heading2"/>
       <w:lvlText w:val="%1."/>
       <w:lvlJc w:val="left"/>
       <w:pPr>
@@ -27279,7 +27177,7 @@
     <w:lsdException w:name="Unresolved Mention" w:semiHidden="1" w:unhideWhenUsed="1"/>
     <w:lsdException w:name="Smart Link" w:semiHidden="1" w:unhideWhenUsed="1"/>
   </w:latentStyles>
-  <w:style w:type="paragraph" w:default="1" w:styleId="Norml">
+  <w:style w:type="paragraph" w:default="1" w:styleId="Normal">
     <w:name w:val="Normal"/>
     <w:qFormat/>
     <w:rsid w:val="00EF4091"/>
@@ -27288,10 +27186,10 @@
       <w:color w:val="000000"/>
     </w:rPr>
   </w:style>
-  <w:style w:type="paragraph" w:styleId="Cmsor1">
+  <w:style w:type="paragraph" w:styleId="Heading1">
     <w:name w:val="heading 1"/>
-    <w:next w:val="Norml"/>
-    <w:link w:val="Cmsor1Char"/>
+    <w:next w:val="Normal"/>
+    <w:link w:val="Heading1Char"/>
     <w:uiPriority w:val="9"/>
     <w:qFormat/>
     <w:rsid w:val="00B030B6"/>
@@ -27312,10 +27210,10 @@
       <w:sz w:val="30"/>
     </w:rPr>
   </w:style>
-  <w:style w:type="paragraph" w:styleId="Cmsor2">
+  <w:style w:type="paragraph" w:styleId="Heading2">
     <w:name w:val="heading 2"/>
-    <w:next w:val="Norml"/>
-    <w:link w:val="Cmsor2Char"/>
+    <w:next w:val="Normal"/>
+    <w:link w:val="Heading2Char"/>
     <w:uiPriority w:val="9"/>
     <w:unhideWhenUsed/>
     <w:qFormat/>
@@ -27335,10 +27233,10 @@
       <w:sz w:val="26"/>
     </w:rPr>
   </w:style>
-  <w:style w:type="paragraph" w:styleId="Cmsor3">
+  <w:style w:type="paragraph" w:styleId="Heading3">
     <w:name w:val="heading 3"/>
-    <w:next w:val="Norml"/>
-    <w:link w:val="Cmsor3Char"/>
+    <w:next w:val="Normal"/>
+    <w:link w:val="Heading3Char"/>
     <w:uiPriority w:val="9"/>
     <w:unhideWhenUsed/>
     <w:qFormat/>
@@ -27355,10 +27253,10 @@
       <w:color w:val="000000"/>
     </w:rPr>
   </w:style>
-  <w:style w:type="paragraph" w:styleId="Cmsor4">
+  <w:style w:type="paragraph" w:styleId="Heading4">
     <w:name w:val="heading 4"/>
-    <w:next w:val="Norml"/>
-    <w:link w:val="Cmsor4Char"/>
+    <w:next w:val="Normal"/>
+    <w:link w:val="Heading4Char"/>
     <w:uiPriority w:val="9"/>
     <w:unhideWhenUsed/>
     <w:qFormat/>
@@ -27377,13 +27275,13 @@
       <w:sz w:val="24"/>
     </w:rPr>
   </w:style>
-  <w:style w:type="character" w:default="1" w:styleId="Bekezdsalapbettpusa">
+  <w:style w:type="character" w:default="1" w:styleId="DefaultParagraphFont">
     <w:name w:val="Default Paragraph Font"/>
     <w:uiPriority w:val="1"/>
     <w:semiHidden/>
     <w:unhideWhenUsed/>
   </w:style>
-  <w:style w:type="table" w:default="1" w:styleId="Normltblzat">
+  <w:style w:type="table" w:default="1" w:styleId="TableNormal">
     <w:name w:val="Normal Table"/>
     <w:uiPriority w:val="99"/>
     <w:semiHidden/>
@@ -27398,15 +27296,15 @@
       </w:tblCellMar>
     </w:tblPr>
   </w:style>
-  <w:style w:type="numbering" w:default="1" w:styleId="Nemlista">
+  <w:style w:type="numbering" w:default="1" w:styleId="NoList">
     <w:name w:val="No List"/>
     <w:uiPriority w:val="99"/>
     <w:semiHidden/>
     <w:unhideWhenUsed/>
   </w:style>
-  <w:style w:type="character" w:customStyle="1" w:styleId="Cmsor2Char">
-    <w:name w:val="Címsor 2 Char"/>
-    <w:link w:val="Cmsor2"/>
+  <w:style w:type="character" w:customStyle="1" w:styleId="Heading2Char">
+    <w:name w:val="Heading 2 Char"/>
+    <w:link w:val="Heading2"/>
     <w:uiPriority w:val="9"/>
     <w:rsid w:val="0046636F"/>
     <w:rPr>
@@ -27415,9 +27313,9 @@
       <w:sz w:val="26"/>
     </w:rPr>
   </w:style>
-  <w:style w:type="character" w:customStyle="1" w:styleId="Cmsor4Char">
-    <w:name w:val="Címsor 4 Char"/>
-    <w:link w:val="Cmsor4"/>
+  <w:style w:type="character" w:customStyle="1" w:styleId="Heading4Char">
+    <w:name w:val="Heading 4 Char"/>
+    <w:link w:val="Heading4"/>
     <w:uiPriority w:val="9"/>
     <w:rsid w:val="00F92CB3"/>
     <w:rPr>
@@ -27427,9 +27325,9 @@
       <w:sz w:val="24"/>
     </w:rPr>
   </w:style>
-  <w:style w:type="character" w:customStyle="1" w:styleId="Cmsor1Char">
-    <w:name w:val="Címsor 1 Char"/>
-    <w:link w:val="Cmsor1"/>
+  <w:style w:type="character" w:customStyle="1" w:styleId="Heading1Char">
+    <w:name w:val="Heading 1 Char"/>
+    <w:link w:val="Heading1"/>
     <w:uiPriority w:val="9"/>
     <w:rsid w:val="00B030B6"/>
     <w:rPr>
@@ -27439,9 +27337,9 @@
       <w:sz w:val="30"/>
     </w:rPr>
   </w:style>
-  <w:style w:type="character" w:customStyle="1" w:styleId="Cmsor3Char">
-    <w:name w:val="Címsor 3 Char"/>
-    <w:link w:val="Cmsor3"/>
+  <w:style w:type="character" w:customStyle="1" w:styleId="Heading3Char">
+    <w:name w:val="Heading 3 Char"/>
+    <w:link w:val="Heading3"/>
     <w:rPr>
       <w:rFonts w:ascii="Times New Roman" w:eastAsia="Times New Roman" w:hAnsi="Times New Roman" w:cs="Times New Roman"/>
       <w:b/>
@@ -27449,7 +27347,7 @@
       <w:sz w:val="22"/>
     </w:rPr>
   </w:style>
-  <w:style w:type="paragraph" w:styleId="TJ1">
+  <w:style w:type="paragraph" w:styleId="TOC1">
     <w:name w:val="toc 1"/>
     <w:hidden/>
     <w:uiPriority w:val="39"/>
@@ -27465,7 +27363,7 @@
       <w:sz w:val="20"/>
     </w:rPr>
   </w:style>
-  <w:style w:type="paragraph" w:styleId="TJ2">
+  <w:style w:type="paragraph" w:styleId="TOC2">
     <w:name w:val="toc 2"/>
     <w:hidden/>
     <w:uiPriority w:val="39"/>
@@ -27481,7 +27379,7 @@
       <w:sz w:val="20"/>
     </w:rPr>
   </w:style>
-  <w:style w:type="paragraph" w:styleId="TJ3">
+  <w:style w:type="paragraph" w:styleId="TOC3">
     <w:name w:val="toc 3"/>
     <w:hidden/>
     <w:uiPriority w:val="39"/>
@@ -27509,9 +27407,9 @@
       </w:tblCellMar>
     </w:tblPr>
   </w:style>
-  <w:style w:type="character" w:styleId="Hiperhivatkozs">
+  <w:style w:type="character" w:styleId="Hyperlink">
     <w:name w:val="Hyperlink"/>
-    <w:basedOn w:val="Bekezdsalapbettpusa"/>
+    <w:basedOn w:val="DefaultParagraphFont"/>
     <w:uiPriority w:val="99"/>
     <w:unhideWhenUsed/>
     <w:rsid w:val="00277937"/>
@@ -27520,9 +27418,9 @@
       <w:u w:val="single"/>
     </w:rPr>
   </w:style>
-  <w:style w:type="paragraph" w:styleId="Listaszerbekezds">
+  <w:style w:type="paragraph" w:styleId="ListParagraph">
     <w:name w:val="List Paragraph"/>
-    <w:basedOn w:val="Norml"/>
+    <w:basedOn w:val="Normal"/>
     <w:uiPriority w:val="34"/>
     <w:qFormat/>
     <w:rsid w:val="006A21B4"/>
@@ -27539,9 +27437,9 @@
       <w14:ligatures w14:val="standardContextual"/>
     </w:rPr>
   </w:style>
-  <w:style w:type="table" w:styleId="Rcsostblzat">
+  <w:style w:type="table" w:styleId="TableGrid0">
     <w:name w:val="Table Grid"/>
-    <w:basedOn w:val="Normltblzat"/>
+    <w:basedOn w:val="TableNormal"/>
     <w:uiPriority w:val="39"/>
     <w:rsid w:val="00D42669"/>
     <w:pPr>
@@ -27558,9 +27456,9 @@
       </w:tblBorders>
     </w:tblPr>
   </w:style>
-  <w:style w:type="character" w:styleId="Feloldatlanmegemlts">
+  <w:style w:type="character" w:styleId="UnresolvedMention">
     <w:name w:val="Unresolved Mention"/>
-    <w:basedOn w:val="Bekezdsalapbettpusa"/>
+    <w:basedOn w:val="DefaultParagraphFont"/>
     <w:uiPriority w:val="99"/>
     <w:semiHidden/>
     <w:unhideWhenUsed/>
@@ -27570,10 +27468,10 @@
       <w:shd w:val="clear" w:color="auto" w:fill="E1DFDD"/>
     </w:rPr>
   </w:style>
-  <w:style w:type="paragraph" w:styleId="llb">
+  <w:style w:type="paragraph" w:styleId="Footer">
     <w:name w:val="footer"/>
-    <w:basedOn w:val="Norml"/>
-    <w:link w:val="llbChar"/>
+    <w:basedOn w:val="Normal"/>
+    <w:link w:val="FooterChar"/>
     <w:uiPriority w:val="99"/>
     <w:unhideWhenUsed/>
     <w:rsid w:val="006C1212"/>
@@ -27585,10 +27483,10 @@
       <w:spacing w:after="0" w:line="240" w:lineRule="auto"/>
     </w:pPr>
   </w:style>
-  <w:style w:type="character" w:customStyle="1" w:styleId="llbChar">
-    <w:name w:val="Élőláb Char"/>
-    <w:basedOn w:val="Bekezdsalapbettpusa"/>
-    <w:link w:val="llb"/>
+  <w:style w:type="character" w:customStyle="1" w:styleId="FooterChar">
+    <w:name w:val="Footer Char"/>
+    <w:basedOn w:val="DefaultParagraphFont"/>
+    <w:link w:val="Footer"/>
     <w:uiPriority w:val="99"/>
     <w:rsid w:val="006C1212"/>
     <w:rPr>
@@ -27596,9 +27494,9 @@
       <w:color w:val="000000"/>
     </w:rPr>
   </w:style>
-  <w:style w:type="table" w:styleId="Tblzatrcsos45jellszn">
+  <w:style w:type="table" w:styleId="GridTable4-Accent5">
     <w:name w:val="Grid Table 4 Accent 5"/>
-    <w:basedOn w:val="Normltblzat"/>
+    <w:basedOn w:val="TableNormal"/>
     <w:uiPriority w:val="49"/>
     <w:rsid w:val="003B546A"/>
     <w:pPr>
@@ -27678,9 +27576,9 @@
       </w:tcPr>
     </w:tblStylePr>
   </w:style>
-  <w:style w:type="character" w:styleId="Jegyzethivatkozs">
+  <w:style w:type="character" w:styleId="CommentReference">
     <w:name w:val="annotation reference"/>
-    <w:basedOn w:val="Bekezdsalapbettpusa"/>
+    <w:basedOn w:val="DefaultParagraphFont"/>
     <w:uiPriority w:val="99"/>
     <w:semiHidden/>
     <w:unhideWhenUsed/>
@@ -27690,10 +27588,10 @@
       <w:szCs w:val="16"/>
     </w:rPr>
   </w:style>
-  <w:style w:type="paragraph" w:styleId="Jegyzetszveg">
+  <w:style w:type="paragraph" w:styleId="CommentText">
     <w:name w:val="annotation text"/>
-    <w:basedOn w:val="Norml"/>
-    <w:link w:val="JegyzetszvegChar"/>
+    <w:basedOn w:val="Normal"/>
+    <w:link w:val="CommentTextChar"/>
     <w:uiPriority w:val="99"/>
     <w:unhideWhenUsed/>
     <w:rsid w:val="001924F0"/>
@@ -27705,10 +27603,10 @@
       <w:szCs w:val="20"/>
     </w:rPr>
   </w:style>
-  <w:style w:type="character" w:customStyle="1" w:styleId="JegyzetszvegChar">
-    <w:name w:val="Jegyzetszöveg Char"/>
-    <w:basedOn w:val="Bekezdsalapbettpusa"/>
-    <w:link w:val="Jegyzetszveg"/>
+  <w:style w:type="character" w:customStyle="1" w:styleId="CommentTextChar">
+    <w:name w:val="Comment Text Char"/>
+    <w:basedOn w:val="DefaultParagraphFont"/>
+    <w:link w:val="CommentText"/>
     <w:uiPriority w:val="99"/>
     <w:rsid w:val="001924F0"/>
     <w:rPr>
@@ -27718,11 +27616,11 @@
       <w:szCs w:val="20"/>
     </w:rPr>
   </w:style>
-  <w:style w:type="paragraph" w:styleId="Megjegyzstrgya">
+  <w:style w:type="paragraph" w:styleId="CommentSubject">
     <w:name w:val="annotation subject"/>
-    <w:basedOn w:val="Jegyzetszveg"/>
-    <w:next w:val="Jegyzetszveg"/>
-    <w:link w:val="MegjegyzstrgyaChar"/>
+    <w:basedOn w:val="CommentText"/>
+    <w:next w:val="CommentText"/>
+    <w:link w:val="CommentSubjectChar"/>
     <w:uiPriority w:val="99"/>
     <w:semiHidden/>
     <w:unhideWhenUsed/>
@@ -27732,10 +27630,10 @@
       <w:bCs/>
     </w:rPr>
   </w:style>
-  <w:style w:type="character" w:customStyle="1" w:styleId="MegjegyzstrgyaChar">
-    <w:name w:val="Megjegyzés tárgya Char"/>
-    <w:basedOn w:val="JegyzetszvegChar"/>
-    <w:link w:val="Megjegyzstrgya"/>
+  <w:style w:type="character" w:customStyle="1" w:styleId="CommentSubjectChar">
+    <w:name w:val="Comment Subject Char"/>
+    <w:basedOn w:val="CommentTextChar"/>
+    <w:link w:val="CommentSubject"/>
     <w:uiPriority w:val="99"/>
     <w:semiHidden/>
     <w:rsid w:val="001924F0"/>
@@ -27750,10 +27648,10 @@
   </w:style>
   <w:style w:type="character" w:customStyle="1" w:styleId="ui-provider">
     <w:name w:val="ui-provider"/>
-    <w:basedOn w:val="Bekezdsalapbettpusa"/>
+    <w:basedOn w:val="DefaultParagraphFont"/>
     <w:rsid w:val="00691B54"/>
   </w:style>
-  <w:style w:type="paragraph" w:styleId="Vltozat">
+  <w:style w:type="paragraph" w:styleId="Revision">
     <w:name w:val="Revision"/>
     <w:hidden/>
     <w:uiPriority w:val="99"/>
@@ -27767,9 +27665,9 @@
       <w:color w:val="000000"/>
     </w:rPr>
   </w:style>
-  <w:style w:type="character" w:styleId="Mrltotthiperhivatkozs">
+  <w:style w:type="character" w:styleId="FollowedHyperlink">
     <w:name w:val="FollowedHyperlink"/>
-    <w:basedOn w:val="Bekezdsalapbettpusa"/>
+    <w:basedOn w:val="DefaultParagraphFont"/>
     <w:uiPriority w:val="99"/>
     <w:semiHidden/>
     <w:unhideWhenUsed/>
@@ -28078,12 +27976,6 @@
 </file>
 
 <file path=customXml/item1.xml><?xml version="1.0" encoding="utf-8"?>
-<p:properties xmlns:p="http://schemas.microsoft.com/office/2006/metadata/properties" xmlns:xsi="http://www.w3.org/2001/XMLSchema-instance" xmlns:pc="http://schemas.microsoft.com/office/infopath/2007/PartnerControls">
-  <documentManagement/>
-</p:properties>
-</file>
-
-<file path=customXml/item2.xml><?xml version="1.0" encoding="utf-8"?>
 <?mso-contentType ?>
 <FormTemplates xmlns="http://schemas.microsoft.com/sharepoint/v3/contenttype/forms">
   <Display>DocumentLibraryForm</Display>
@@ -28092,11 +27984,13 @@
 </FormTemplates>
 </file>
 
-<file path=customXml/item3.xml><?xml version="1.0" encoding="utf-8"?>
-<b:Sources xmlns:b="http://schemas.openxmlformats.org/officeDocument/2006/bibliography" xmlns="http://schemas.openxmlformats.org/officeDocument/2006/bibliography" SelectedStyle="\APASixthEditionOfficeOnline.xsl" StyleName="APA" Version="6"/>
+<file path=customXml/item2.xml><?xml version="1.0" encoding="utf-8"?>
+<p:properties xmlns:p="http://schemas.microsoft.com/office/2006/metadata/properties" xmlns:xsi="http://www.w3.org/2001/XMLSchema-instance" xmlns:pc="http://schemas.microsoft.com/office/infopath/2007/PartnerControls">
+  <documentManagement/>
+</p:properties>
 </file>
 
-<file path=customXml/item4.xml><?xml version="1.0" encoding="utf-8"?>
+<file path=customXml/item3.xml><?xml version="1.0" encoding="utf-8"?>
 <ct:contentTypeSchema xmlns:ct="http://schemas.microsoft.com/office/2006/metadata/contentType" xmlns:ma="http://schemas.microsoft.com/office/2006/metadata/properties/metaAttributes" ct:_="" ma:_="" ma:contentTypeName="Dokumentum" ma:contentTypeID="0x010100547A55C068818A43A8BB2703D743D8BE" ma:contentTypeVersion="0" ma:contentTypeDescription="Új dokumentum létrehozása." ma:contentTypeScope="" ma:versionID="677179708cd6a2061476446520c1c416">
   <xsd:schema xmlns:xsd="http://www.w3.org/2001/XMLSchema" xmlns:xs="http://www.w3.org/2001/XMLSchema" xmlns:p="http://schemas.microsoft.com/office/2006/metadata/properties" targetNamespace="http://schemas.microsoft.com/office/2006/metadata/properties" ma:root="true" ma:fieldsID="08dee037046ad32af3116d3be75d37a6">
     <xsd:element name="properties">
@@ -28210,7 +28104,19 @@
 </ct:contentTypeSchema>
 </file>
 
+<file path=customXml/item4.xml><?xml version="1.0" encoding="utf-8"?>
+<b:Sources xmlns:b="http://schemas.openxmlformats.org/officeDocument/2006/bibliography" xmlns="http://schemas.openxmlformats.org/officeDocument/2006/bibliography" SelectedStyle="\APASixthEditionOfficeOnline.xsl" StyleName="APA" Version="6"/>
+</file>
+
 <file path=customXml/itemProps1.xml><?xml version="1.0" encoding="utf-8"?>
+<ds:datastoreItem xmlns:ds="http://schemas.openxmlformats.org/officeDocument/2006/customXml" ds:itemID="{28923AFE-DC5A-4221-AE77-BD20F9C4CF75}">
+  <ds:schemaRefs>
+    <ds:schemaRef ds:uri="http://schemas.microsoft.com/sharepoint/v3/contenttype/forms"/>
+  </ds:schemaRefs>
+</ds:datastoreItem>
+</file>
+
+<file path=customXml/itemProps2.xml><?xml version="1.0" encoding="utf-8"?>
 <ds:datastoreItem xmlns:ds="http://schemas.openxmlformats.org/officeDocument/2006/customXml" ds:itemID="{BDE212CA-BC8E-45BB-9616-6296F64F802D}">
   <ds:schemaRefs>
     <ds:schemaRef ds:uri="http://schemas.microsoft.com/office/2006/metadata/properties"/>
@@ -28219,23 +28125,7 @@
 </ds:datastoreItem>
 </file>
 
-<file path=customXml/itemProps2.xml><?xml version="1.0" encoding="utf-8"?>
-<ds:datastoreItem xmlns:ds="http://schemas.openxmlformats.org/officeDocument/2006/customXml" ds:itemID="{28923AFE-DC5A-4221-AE77-BD20F9C4CF75}">
-  <ds:schemaRefs>
-    <ds:schemaRef ds:uri="http://schemas.microsoft.com/sharepoint/v3/contenttype/forms"/>
-  </ds:schemaRefs>
-</ds:datastoreItem>
-</file>
-
 <file path=customXml/itemProps3.xml><?xml version="1.0" encoding="utf-8"?>
-<ds:datastoreItem xmlns:ds="http://schemas.openxmlformats.org/officeDocument/2006/customXml" ds:itemID="{591D78F0-EE4D-4606-A14C-1D681FC99DBF}">
-  <ds:schemaRefs>
-    <ds:schemaRef ds:uri="http://schemas.openxmlformats.org/officeDocument/2006/bibliography"/>
-  </ds:schemaRefs>
-</ds:datastoreItem>
-</file>
-
-<file path=customXml/itemProps4.xml><?xml version="1.0" encoding="utf-8"?>
 <ds:datastoreItem xmlns:ds="http://schemas.openxmlformats.org/officeDocument/2006/customXml" ds:itemID="{5DBE1F02-EA77-40BD-91B2-6714162069BC}">
   <ds:schemaRefs>
     <ds:schemaRef ds:uri="http://schemas.microsoft.com/office/2006/metadata/contentType"/>
@@ -28249,4 +28139,12 @@
     <ds:schemaRef ds:uri="http://schemas.microsoft.com/office/infopath/2007/PartnerControls"/>
   </ds:schemaRefs>
 </ds:datastoreItem>
+</file>
+
+<file path=customXml/itemProps4.xml><?xml version="1.0" encoding="utf-8"?>
+<ds:datastoreItem xmlns:ds="http://schemas.openxmlformats.org/officeDocument/2006/customXml" ds:itemID="{591D78F0-EE4D-4606-A14C-1D681FC99DBF}">
+  <ds:schemaRefs>
+    <ds:schemaRef ds:uri="http://schemas.openxmlformats.org/officeDocument/2006/bibliography"/>
+  </ds:schemaRefs>
+</ds:datastoreItem>
 </file>
</xml_diff>

<commit_message>
Bizonylat API - Kalkulacio response-ban felesleges tomorites paraméter törlése
</commit_message>
<xml_diff>
--- a/docs/spec/M2M új bizonylat interfész specifikáció 1.0.docx
+++ b/docs/spec/M2M új bizonylat interfész specifikáció 1.0.docx
@@ -9877,7 +9877,99 @@
           </w:tcPr>
           <w:p>
             <w:r>
-              <w:t>A bizonylat típusa</w:t>
+              <w:t xml:space="preserve">A bizonylat típusának azonosítója, </w:t>
+            </w:r>
+            <w:proofErr w:type="spellStart"/>
+            <w:r>
+              <w:t>pl</w:t>
+            </w:r>
+            <w:proofErr w:type="spellEnd"/>
+            <w:r>
+              <w:t xml:space="preserve"> T1042E.</w:t>
+            </w:r>
+            <w:r>
+              <w:br/>
+              <w:t xml:space="preserve">A </w:t>
+            </w:r>
+            <w:proofErr w:type="spellStart"/>
+            <w:r>
+              <w:t>nav</w:t>
+            </w:r>
+            <w:proofErr w:type="spellEnd"/>
+            <w:r>
+              <w:t>-</w:t>
+            </w:r>
+            <w:proofErr w:type="spellStart"/>
+            <w:r>
+              <w:t>gov</w:t>
+            </w:r>
+            <w:proofErr w:type="spellEnd"/>
+            <w:r>
+              <w:t>-hu-</w:t>
+            </w:r>
+            <w:proofErr w:type="spellStart"/>
+            <w:r>
+              <w:t>templates</w:t>
+            </w:r>
+            <w:proofErr w:type="spellEnd"/>
+            <w:r>
+              <w:t xml:space="preserve"> </w:t>
+            </w:r>
+            <w:proofErr w:type="spellStart"/>
+            <w:r>
+              <w:t>Github</w:t>
+            </w:r>
+            <w:proofErr w:type="spellEnd"/>
+            <w:r>
+              <w:t xml:space="preserve"> oldalakon lévő XSD fájlokban lévő </w:t>
+            </w:r>
+            <w:proofErr w:type="spellStart"/>
+            <w:r>
+              <w:t>namespace-ből</w:t>
+            </w:r>
+            <w:proofErr w:type="spellEnd"/>
+            <w:r>
+              <w:t xml:space="preserve"> kell venni az értéket.</w:t>
+            </w:r>
+            <w:r>
+              <w:br/>
+              <w:t xml:space="preserve">Ennek az azonosítónak egyeznie kell a beküldött </w:t>
+            </w:r>
+            <w:proofErr w:type="spellStart"/>
+            <w:r>
+              <w:t>xml</w:t>
+            </w:r>
+            <w:proofErr w:type="spellEnd"/>
+            <w:r>
+              <w:t xml:space="preserve"> </w:t>
+            </w:r>
+            <w:proofErr w:type="spellStart"/>
+            <w:r>
+              <w:t>namespace</w:t>
+            </w:r>
+            <w:proofErr w:type="spellEnd"/>
+            <w:r>
+              <w:t>-ben lévő bizonylat azonosítóval.</w:t>
+            </w:r>
+            <w:r>
+              <w:br/>
+              <w:t xml:space="preserve">Amennyiben nem egyezik az itt megadott érték a beküldött </w:t>
+            </w:r>
+            <w:proofErr w:type="spellStart"/>
+            <w:r>
+              <w:t>xml</w:t>
+            </w:r>
+            <w:proofErr w:type="spellEnd"/>
+            <w:r>
+              <w:t xml:space="preserve"> </w:t>
+            </w:r>
+            <w:proofErr w:type="spellStart"/>
+            <w:r>
+              <w:t>namespace</w:t>
+            </w:r>
+            <w:proofErr w:type="spellEnd"/>
+            <w:r>
+              <w:t>-ben lévővel, úgy a válaszban XSD validációs hiba fog visszaérkezni.</w:t>
             </w:r>
           </w:p>
         </w:tc>
@@ -9933,7 +10025,102 @@
           </w:tcPr>
           <w:p>
             <w:r>
-              <w:t>A bizonylat verziószáma</w:t>
+              <w:t xml:space="preserve">A bizonylat verziószáma, </w:t>
+            </w:r>
+            <w:proofErr w:type="spellStart"/>
+            <w:r>
+              <w:t>pl</w:t>
+            </w:r>
+            <w:proofErr w:type="spellEnd"/>
+            <w:r>
+              <w:t xml:space="preserve"> 1.0.</w:t>
+            </w:r>
+            <w:r>
+              <w:br/>
+              <w:t xml:space="preserve">A </w:t>
+            </w:r>
+            <w:proofErr w:type="spellStart"/>
+            <w:r>
+              <w:t>nav</w:t>
+            </w:r>
+            <w:proofErr w:type="spellEnd"/>
+            <w:r>
+              <w:t>-</w:t>
+            </w:r>
+            <w:proofErr w:type="spellStart"/>
+            <w:r>
+              <w:t>gov</w:t>
+            </w:r>
+            <w:proofErr w:type="spellEnd"/>
+            <w:r>
+              <w:t>-hu-</w:t>
+            </w:r>
+            <w:proofErr w:type="spellStart"/>
+            <w:r>
+              <w:t>templates</w:t>
+            </w:r>
+            <w:proofErr w:type="spellEnd"/>
+            <w:r>
+              <w:t xml:space="preserve"> </w:t>
+            </w:r>
+            <w:proofErr w:type="spellStart"/>
+            <w:r>
+              <w:t>Github</w:t>
+            </w:r>
+            <w:proofErr w:type="spellEnd"/>
+            <w:r>
+              <w:t xml:space="preserve"> oldalakon lévő XSD fájlokban lévő </w:t>
+            </w:r>
+            <w:proofErr w:type="spellStart"/>
+            <w:r>
+              <w:t>namespace-ből</w:t>
+            </w:r>
+            <w:proofErr w:type="spellEnd"/>
+            <w:r>
+              <w:t xml:space="preserve"> kell venni az értéket.</w:t>
+            </w:r>
+            <w:r>
+              <w:br/>
+            </w:r>
+            <w:r>
+              <w:lastRenderedPageBreak/>
+              <w:t xml:space="preserve">Ennek a verziószámnak egyeznie kell a beküldött </w:t>
+            </w:r>
+            <w:proofErr w:type="spellStart"/>
+            <w:r>
+              <w:t>xml</w:t>
+            </w:r>
+            <w:proofErr w:type="spellEnd"/>
+            <w:r>
+              <w:t xml:space="preserve"> </w:t>
+            </w:r>
+            <w:proofErr w:type="spellStart"/>
+            <w:r>
+              <w:t>namespace</w:t>
+            </w:r>
+            <w:proofErr w:type="spellEnd"/>
+            <w:r>
+              <w:t>-ben lévő bizonylat verzióval.</w:t>
+            </w:r>
+            <w:r>
+              <w:br/>
+              <w:t xml:space="preserve">Amennyiben nem egyezik az itt megadott érték a beküldött </w:t>
+            </w:r>
+            <w:proofErr w:type="spellStart"/>
+            <w:r>
+              <w:t>xml</w:t>
+            </w:r>
+            <w:proofErr w:type="spellEnd"/>
+            <w:r>
+              <w:t xml:space="preserve"> </w:t>
+            </w:r>
+            <w:proofErr w:type="spellStart"/>
+            <w:r>
+              <w:t>namespace</w:t>
+            </w:r>
+            <w:proofErr w:type="spellEnd"/>
+            <w:r>
+              <w:t>-ben lévővel, úgy a válaszban XSD validációs hiba fog visszaérkezni.</w:t>
             </w:r>
           </w:p>
         </w:tc>
@@ -9947,6 +10134,7 @@
           <w:p>
             <w:proofErr w:type="spellStart"/>
             <w:r>
+              <w:lastRenderedPageBreak/>
               <w:t>bizonylatXml</w:t>
             </w:r>
             <w:proofErr w:type="spellEnd"/>
@@ -10160,7 +10348,6 @@
     <w:p/>
     <w:p>
       <w:r>
-        <w:lastRenderedPageBreak/>
         <w:t xml:space="preserve">Tájékoztatásként a használt, de az interfészen nem </w:t>
       </w:r>
       <w:r>
@@ -10792,29 +10979,21 @@
               <w:jc w:val="both"/>
             </w:pPr>
             <w:r>
-              <w:t>A kalkulált számított mezőket tartalmazó</w:t>
+              <w:t xml:space="preserve">A kalkulált számított mezőket  tartalmazó bizonylat file </w:t>
+            </w:r>
+            <w:proofErr w:type="spellStart"/>
+            <w:r>
+              <w:t>base</w:t>
+            </w:r>
+            <w:proofErr w:type="spellEnd"/>
+            <w:r>
+              <w:t xml:space="preserve"> 64</w:t>
             </w:r>
             <w:r>
               <w:t xml:space="preserve"> </w:t>
             </w:r>
             <w:r>
-              <w:t xml:space="preserve">bizonylat file </w:t>
-            </w:r>
-            <w:proofErr w:type="spellStart"/>
-            <w:r>
-              <w:t>base</w:t>
-            </w:r>
-            <w:proofErr w:type="spellEnd"/>
-            <w:r>
-              <w:t xml:space="preserve"> 64 kódolással. A </w:t>
-            </w:r>
-            <w:proofErr w:type="spellStart"/>
-            <w:r>
-              <w:t>tomorites</w:t>
-            </w:r>
-            <w:proofErr w:type="spellEnd"/>
-            <w:r>
-              <w:t xml:space="preserve"> paraméter adja, meg, hogy tömörtett volt-e a fájl, és ha igen, akkor milyen módon, mielőtt kódolva lett.</w:t>
+              <w:t>kódolással és bzip2 tömörítéssel.</w:t>
             </w:r>
           </w:p>
         </w:tc>
@@ -10886,65 +11065,6 @@
             </w:r>
             <w:r>
               <w:t>.</w:t>
-            </w:r>
-          </w:p>
-        </w:tc>
-      </w:tr>
-      <w:tr>
-        <w:tc>
-          <w:tcPr>
-            <w:tcW w:w="2559" w:type="dxa"/>
-            <w:shd w:val="clear" w:color="auto" w:fill="D9D9D9" w:themeFill="background1" w:themeFillShade="D9"/>
-          </w:tcPr>
-          <w:p>
-            <w:proofErr w:type="spellStart"/>
-            <w:r>
-              <w:t>tomorites</w:t>
-            </w:r>
-            <w:proofErr w:type="spellEnd"/>
-          </w:p>
-        </w:tc>
-        <w:tc>
-          <w:tcPr>
-            <w:tcW w:w="2578" w:type="dxa"/>
-            <w:shd w:val="clear" w:color="auto" w:fill="D9D9D9" w:themeFill="background1" w:themeFillShade="D9"/>
-          </w:tcPr>
-          <w:p>
-            <w:pPr>
-              <w:jc w:val="center"/>
-            </w:pPr>
-            <w:proofErr w:type="spellStart"/>
-            <w:r>
-              <w:t>enum</w:t>
-            </w:r>
-            <w:proofErr w:type="spellEnd"/>
-          </w:p>
-        </w:tc>
-        <w:tc>
-          <w:tcPr>
-            <w:tcW w:w="1047" w:type="dxa"/>
-            <w:shd w:val="clear" w:color="auto" w:fill="D9D9D9" w:themeFill="background1" w:themeFillShade="D9"/>
-          </w:tcPr>
-          <w:p>
-            <w:pPr>
-              <w:jc w:val="center"/>
-            </w:pPr>
-            <w:r>
-              <w:t>nem</w:t>
-            </w:r>
-          </w:p>
-        </w:tc>
-        <w:tc>
-          <w:tcPr>
-            <w:tcW w:w="2883" w:type="dxa"/>
-            <w:shd w:val="clear" w:color="auto" w:fill="D9D9D9" w:themeFill="background1" w:themeFillShade="D9"/>
-          </w:tcPr>
-          <w:p>
-            <w:pPr>
-              <w:jc w:val="both"/>
-            </w:pPr>
-            <w:r>
-              <w:t>A bizonylatfájl tömörítésének módja a base64 kódolás előtt.</w:t>
             </w:r>
           </w:p>
         </w:tc>
@@ -11336,6 +11456,7 @@
           <w:p>
             <w:proofErr w:type="spellStart"/>
             <w:r>
+              <w:lastRenderedPageBreak/>
               <w:t>mezoAzonosito</w:t>
             </w:r>
             <w:proofErr w:type="spellEnd"/>
@@ -11581,7 +11702,6 @@
           </w:tcPr>
           <w:p>
             <w:r>
-              <w:lastRenderedPageBreak/>
               <w:t>SIKERTELEN</w:t>
             </w:r>
           </w:p>
@@ -12389,6 +12509,7 @@
                 <w:b/>
                 <w:bCs/>
               </w:rPr>
+              <w:lastRenderedPageBreak/>
               <w:t>leírás</w:t>
             </w:r>
           </w:p>
@@ -12668,7 +12789,6 @@
           <w:bCs/>
           <w:u w:val="single"/>
         </w:rPr>
-        <w:lastRenderedPageBreak/>
         <w:t>Válasz:</w:t>
       </w:r>
     </w:p>
@@ -13002,65 +13122,6 @@
             </w:r>
             <w:r>
               <w:t>.</w:t>
-            </w:r>
-          </w:p>
-        </w:tc>
-      </w:tr>
-      <w:tr>
-        <w:tc>
-          <w:tcPr>
-            <w:tcW w:w="2559" w:type="dxa"/>
-            <w:shd w:val="clear" w:color="auto" w:fill="D9D9D9" w:themeFill="background1" w:themeFillShade="D9"/>
-          </w:tcPr>
-          <w:p>
-            <w:proofErr w:type="spellStart"/>
-            <w:r>
-              <w:t>tomorites</w:t>
-            </w:r>
-            <w:proofErr w:type="spellEnd"/>
-          </w:p>
-        </w:tc>
-        <w:tc>
-          <w:tcPr>
-            <w:tcW w:w="2637" w:type="dxa"/>
-            <w:shd w:val="clear" w:color="auto" w:fill="D9D9D9" w:themeFill="background1" w:themeFillShade="D9"/>
-          </w:tcPr>
-          <w:p>
-            <w:pPr>
-              <w:jc w:val="center"/>
-            </w:pPr>
-            <w:proofErr w:type="spellStart"/>
-            <w:r>
-              <w:t>enum</w:t>
-            </w:r>
-            <w:proofErr w:type="spellEnd"/>
-          </w:p>
-        </w:tc>
-        <w:tc>
-          <w:tcPr>
-            <w:tcW w:w="999" w:type="dxa"/>
-            <w:shd w:val="clear" w:color="auto" w:fill="D9D9D9" w:themeFill="background1" w:themeFillShade="D9"/>
-          </w:tcPr>
-          <w:p>
-            <w:pPr>
-              <w:jc w:val="center"/>
-            </w:pPr>
-            <w:r>
-              <w:t>nem</w:t>
-            </w:r>
-          </w:p>
-        </w:tc>
-        <w:tc>
-          <w:tcPr>
-            <w:tcW w:w="2872" w:type="dxa"/>
-            <w:shd w:val="clear" w:color="auto" w:fill="D9D9D9" w:themeFill="background1" w:themeFillShade="D9"/>
-          </w:tcPr>
-          <w:p>
-            <w:pPr>
-              <w:jc w:val="both"/>
-            </w:pPr>
-            <w:r>
-              <w:t>A bizonylatfájl tömörítésének módja a base64 kódolás előtt.</w:t>
             </w:r>
           </w:p>
         </w:tc>
@@ -13563,6 +13624,7 @@
                 <w:b/>
                 <w:bCs/>
               </w:rPr>
+              <w:lastRenderedPageBreak/>
               <w:t>OpenAPI</w:t>
             </w:r>
             <w:proofErr w:type="spellEnd"/>
@@ -13891,7 +13953,6 @@
           <w:p>
             <w:proofErr w:type="spellStart"/>
             <w:r>
-              <w:lastRenderedPageBreak/>
               <w:t>requestData</w:t>
             </w:r>
             <w:proofErr w:type="spellEnd"/>
@@ -14134,7 +14195,99 @@
           </w:tcPr>
           <w:p>
             <w:r>
-              <w:t>A bizonylat típusa</w:t>
+              <w:t xml:space="preserve">A bizonylat típusának azonosítója, </w:t>
+            </w:r>
+            <w:proofErr w:type="spellStart"/>
+            <w:r>
+              <w:t>pl</w:t>
+            </w:r>
+            <w:proofErr w:type="spellEnd"/>
+            <w:r>
+              <w:t xml:space="preserve"> T1042E.</w:t>
+            </w:r>
+            <w:r>
+              <w:br/>
+              <w:t xml:space="preserve">A </w:t>
+            </w:r>
+            <w:proofErr w:type="spellStart"/>
+            <w:r>
+              <w:t>nav</w:t>
+            </w:r>
+            <w:proofErr w:type="spellEnd"/>
+            <w:r>
+              <w:t>-</w:t>
+            </w:r>
+            <w:proofErr w:type="spellStart"/>
+            <w:r>
+              <w:t>gov</w:t>
+            </w:r>
+            <w:proofErr w:type="spellEnd"/>
+            <w:r>
+              <w:t>-hu-</w:t>
+            </w:r>
+            <w:proofErr w:type="spellStart"/>
+            <w:r>
+              <w:t>templates</w:t>
+            </w:r>
+            <w:proofErr w:type="spellEnd"/>
+            <w:r>
+              <w:t xml:space="preserve"> </w:t>
+            </w:r>
+            <w:proofErr w:type="spellStart"/>
+            <w:r>
+              <w:t>Github</w:t>
+            </w:r>
+            <w:proofErr w:type="spellEnd"/>
+            <w:r>
+              <w:t xml:space="preserve"> oldalakon lévő XSD fájlokban lévő </w:t>
+            </w:r>
+            <w:proofErr w:type="spellStart"/>
+            <w:r>
+              <w:t>namespace-ből</w:t>
+            </w:r>
+            <w:proofErr w:type="spellEnd"/>
+            <w:r>
+              <w:t xml:space="preserve"> kell venni az értéket.</w:t>
+            </w:r>
+            <w:r>
+              <w:br/>
+              <w:t xml:space="preserve">Ennek az azonosítónak egyeznie kell a beküldött </w:t>
+            </w:r>
+            <w:proofErr w:type="spellStart"/>
+            <w:r>
+              <w:t>xml</w:t>
+            </w:r>
+            <w:proofErr w:type="spellEnd"/>
+            <w:r>
+              <w:t xml:space="preserve"> </w:t>
+            </w:r>
+            <w:proofErr w:type="spellStart"/>
+            <w:r>
+              <w:t>namespace</w:t>
+            </w:r>
+            <w:proofErr w:type="spellEnd"/>
+            <w:r>
+              <w:t>-ben lévő bizonylat azonosítóval.</w:t>
+            </w:r>
+            <w:r>
+              <w:br/>
+              <w:t xml:space="preserve">Amennyiben nem egyezik az itt megadott érték a beküldött </w:t>
+            </w:r>
+            <w:proofErr w:type="spellStart"/>
+            <w:r>
+              <w:t>xml</w:t>
+            </w:r>
+            <w:proofErr w:type="spellEnd"/>
+            <w:r>
+              <w:t xml:space="preserve"> </w:t>
+            </w:r>
+            <w:proofErr w:type="spellStart"/>
+            <w:r>
+              <w:t>namespace</w:t>
+            </w:r>
+            <w:proofErr w:type="spellEnd"/>
+            <w:r>
+              <w:t>-ben lévővel, úgy a válaszban XSD validációs hiba fog visszaérkezni.</w:t>
             </w:r>
           </w:p>
         </w:tc>
@@ -14190,7 +14343,99 @@
           </w:tcPr>
           <w:p>
             <w:r>
-              <w:t>A bizonylat verziószáma</w:t>
+              <w:t xml:space="preserve">A bizonylat verziószáma, </w:t>
+            </w:r>
+            <w:proofErr w:type="spellStart"/>
+            <w:r>
+              <w:t>pl</w:t>
+            </w:r>
+            <w:proofErr w:type="spellEnd"/>
+            <w:r>
+              <w:t xml:space="preserve"> 1.0.</w:t>
+            </w:r>
+            <w:r>
+              <w:br/>
+              <w:t xml:space="preserve">A </w:t>
+            </w:r>
+            <w:proofErr w:type="spellStart"/>
+            <w:r>
+              <w:t>nav</w:t>
+            </w:r>
+            <w:proofErr w:type="spellEnd"/>
+            <w:r>
+              <w:t>-</w:t>
+            </w:r>
+            <w:proofErr w:type="spellStart"/>
+            <w:r>
+              <w:t>gov</w:t>
+            </w:r>
+            <w:proofErr w:type="spellEnd"/>
+            <w:r>
+              <w:t>-hu-</w:t>
+            </w:r>
+            <w:proofErr w:type="spellStart"/>
+            <w:r>
+              <w:t>templates</w:t>
+            </w:r>
+            <w:proofErr w:type="spellEnd"/>
+            <w:r>
+              <w:t xml:space="preserve"> </w:t>
+            </w:r>
+            <w:proofErr w:type="spellStart"/>
+            <w:r>
+              <w:t>Github</w:t>
+            </w:r>
+            <w:proofErr w:type="spellEnd"/>
+            <w:r>
+              <w:t xml:space="preserve"> oldalakon lévő XSD fájlokban lévő </w:t>
+            </w:r>
+            <w:proofErr w:type="spellStart"/>
+            <w:r>
+              <w:t>namespace-ből</w:t>
+            </w:r>
+            <w:proofErr w:type="spellEnd"/>
+            <w:r>
+              <w:t xml:space="preserve"> kell venni az értéket.</w:t>
+            </w:r>
+            <w:r>
+              <w:br/>
+              <w:t xml:space="preserve">Ennek a verziószámnak egyeznie kell a beküldött </w:t>
+            </w:r>
+            <w:proofErr w:type="spellStart"/>
+            <w:r>
+              <w:t>xml</w:t>
+            </w:r>
+            <w:proofErr w:type="spellEnd"/>
+            <w:r>
+              <w:t xml:space="preserve"> </w:t>
+            </w:r>
+            <w:proofErr w:type="spellStart"/>
+            <w:r>
+              <w:t>namespace</w:t>
+            </w:r>
+            <w:proofErr w:type="spellEnd"/>
+            <w:r>
+              <w:t>-ben lévő bizonylat verzióval.</w:t>
+            </w:r>
+            <w:r>
+              <w:br/>
+              <w:t xml:space="preserve">Amennyiben nem egyezik az itt megadott érték a beküldött </w:t>
+            </w:r>
+            <w:proofErr w:type="spellStart"/>
+            <w:r>
+              <w:t>xml</w:t>
+            </w:r>
+            <w:proofErr w:type="spellEnd"/>
+            <w:r>
+              <w:t xml:space="preserve"> </w:t>
+            </w:r>
+            <w:proofErr w:type="spellStart"/>
+            <w:r>
+              <w:t>namespace</w:t>
+            </w:r>
+            <w:proofErr w:type="spellEnd"/>
+            <w:r>
+              <w:t>-ben lévővel, úgy a válaszban XSD validációs hiba fog visszaérkezni.</w:t>
             </w:r>
           </w:p>
         </w:tc>
@@ -14728,6 +14973,7 @@
     </w:p>
     <w:p>
       <w:r>
+        <w:lastRenderedPageBreak/>
         <w:t xml:space="preserve">A </w:t>
       </w:r>
       <w:proofErr w:type="spellStart"/>
@@ -15176,7 +15422,6 @@
           <w:p>
             <w:proofErr w:type="spellStart"/>
             <w:r>
-              <w:lastRenderedPageBreak/>
               <w:t>resultCode</w:t>
             </w:r>
             <w:proofErr w:type="spellEnd"/>
@@ -15799,6 +16044,7 @@
           </w:tcPr>
           <w:p>
             <w:r>
+              <w:lastRenderedPageBreak/>
               <w:t>ERVENYTELEN_KODOLAS</w:t>
             </w:r>
           </w:p>
@@ -16242,7 +16488,6 @@
                 <w:b/>
                 <w:bCs/>
               </w:rPr>
-              <w:lastRenderedPageBreak/>
               <w:t>OpenAPI</w:t>
             </w:r>
             <w:proofErr w:type="spellEnd"/>
@@ -16905,7 +17150,11 @@
             </w:r>
             <w:proofErr w:type="spellEnd"/>
             <w:r>
-              <w:t xml:space="preserve"> lett. Ha létezik ilyen tanúsítvány, akkor a bizonylat a beküldés során már nem lesz </w:t>
+              <w:t xml:space="preserve"> lett. Ha létezik ilyen tanúsítvány, akkor a bizonylat </w:t>
+            </w:r>
+            <w:r>
+              <w:lastRenderedPageBreak/>
+              <w:t xml:space="preserve">a beküldés során már nem lesz </w:t>
             </w:r>
             <w:proofErr w:type="spellStart"/>
             <w:r>
@@ -16935,6 +17184,7 @@
           <w:p>
             <w:proofErr w:type="spellStart"/>
             <w:r>
+              <w:lastRenderedPageBreak/>
               <w:t>resultCode</w:t>
             </w:r>
             <w:proofErr w:type="spellEnd"/>
@@ -17254,7 +17504,6 @@
           <w:sz w:val="24"/>
           <w:szCs w:val="24"/>
         </w:rPr>
-        <w:lastRenderedPageBreak/>
         <w:t>Bizonylat beküldés művelet</w:t>
       </w:r>
       <w:bookmarkEnd w:id="29"/>
@@ -18012,7 +18261,102 @@
           </w:tcPr>
           <w:p>
             <w:r>
-              <w:t>A bizonylat típusa</w:t>
+              <w:t xml:space="preserve">A bizonylat típusának azonosítója, </w:t>
+            </w:r>
+            <w:proofErr w:type="spellStart"/>
+            <w:r>
+              <w:t>pl</w:t>
+            </w:r>
+            <w:proofErr w:type="spellEnd"/>
+            <w:r>
+              <w:t xml:space="preserve"> T1042E.</w:t>
+            </w:r>
+            <w:r>
+              <w:br/>
+              <w:t xml:space="preserve">A </w:t>
+            </w:r>
+            <w:proofErr w:type="spellStart"/>
+            <w:r>
+              <w:t>nav</w:t>
+            </w:r>
+            <w:proofErr w:type="spellEnd"/>
+            <w:r>
+              <w:t>-</w:t>
+            </w:r>
+            <w:proofErr w:type="spellStart"/>
+            <w:r>
+              <w:t>gov</w:t>
+            </w:r>
+            <w:proofErr w:type="spellEnd"/>
+            <w:r>
+              <w:t>-hu-</w:t>
+            </w:r>
+            <w:proofErr w:type="spellStart"/>
+            <w:r>
+              <w:t>templates</w:t>
+            </w:r>
+            <w:proofErr w:type="spellEnd"/>
+            <w:r>
+              <w:t xml:space="preserve"> </w:t>
+            </w:r>
+            <w:proofErr w:type="spellStart"/>
+            <w:r>
+              <w:t>Github</w:t>
+            </w:r>
+            <w:proofErr w:type="spellEnd"/>
+            <w:r>
+              <w:t xml:space="preserve"> oldalakon lévő XSD fájlokban lévő </w:t>
+            </w:r>
+            <w:proofErr w:type="spellStart"/>
+            <w:r>
+              <w:t>namespace-ből</w:t>
+            </w:r>
+            <w:proofErr w:type="spellEnd"/>
+            <w:r>
+              <w:t xml:space="preserve"> kell venni az értéket.</w:t>
+            </w:r>
+            <w:r>
+              <w:br/>
+            </w:r>
+            <w:r>
+              <w:lastRenderedPageBreak/>
+              <w:t xml:space="preserve">Ennek az azonosítónak egyeznie kell a beküldött </w:t>
+            </w:r>
+            <w:proofErr w:type="spellStart"/>
+            <w:r>
+              <w:t>xml</w:t>
+            </w:r>
+            <w:proofErr w:type="spellEnd"/>
+            <w:r>
+              <w:t xml:space="preserve"> </w:t>
+            </w:r>
+            <w:proofErr w:type="spellStart"/>
+            <w:r>
+              <w:t>namespace</w:t>
+            </w:r>
+            <w:proofErr w:type="spellEnd"/>
+            <w:r>
+              <w:t>-ben lévő bizonylat azonosítóval.</w:t>
+            </w:r>
+            <w:r>
+              <w:br/>
+              <w:t xml:space="preserve">Amennyiben nem egyezik az itt megadott érték a beküldött </w:t>
+            </w:r>
+            <w:proofErr w:type="spellStart"/>
+            <w:r>
+              <w:t>xml</w:t>
+            </w:r>
+            <w:proofErr w:type="spellEnd"/>
+            <w:r>
+              <w:t xml:space="preserve"> </w:t>
+            </w:r>
+            <w:proofErr w:type="spellStart"/>
+            <w:r>
+              <w:t>namespace</w:t>
+            </w:r>
+            <w:proofErr w:type="spellEnd"/>
+            <w:r>
+              <w:t>-ben lévővel, úgy a válaszban XSD validációs hiba fog visszaérkezni.</w:t>
             </w:r>
           </w:p>
         </w:tc>
@@ -18026,6 +18370,7 @@
           <w:p>
             <w:proofErr w:type="spellStart"/>
             <w:r>
+              <w:lastRenderedPageBreak/>
               <w:t>bizonylatVerzio</w:t>
             </w:r>
             <w:proofErr w:type="spellEnd"/>
@@ -18068,7 +18413,99 @@
           </w:tcPr>
           <w:p>
             <w:r>
-              <w:t>A bizonylat verziószáma</w:t>
+              <w:t xml:space="preserve">A bizonylat verziószáma, </w:t>
+            </w:r>
+            <w:proofErr w:type="spellStart"/>
+            <w:r>
+              <w:t>pl</w:t>
+            </w:r>
+            <w:proofErr w:type="spellEnd"/>
+            <w:r>
+              <w:t xml:space="preserve"> 1.0.</w:t>
+            </w:r>
+            <w:r>
+              <w:br/>
+              <w:t xml:space="preserve">A </w:t>
+            </w:r>
+            <w:proofErr w:type="spellStart"/>
+            <w:r>
+              <w:t>nav</w:t>
+            </w:r>
+            <w:proofErr w:type="spellEnd"/>
+            <w:r>
+              <w:t>-</w:t>
+            </w:r>
+            <w:proofErr w:type="spellStart"/>
+            <w:r>
+              <w:t>gov</w:t>
+            </w:r>
+            <w:proofErr w:type="spellEnd"/>
+            <w:r>
+              <w:t>-hu-</w:t>
+            </w:r>
+            <w:proofErr w:type="spellStart"/>
+            <w:r>
+              <w:t>templates</w:t>
+            </w:r>
+            <w:proofErr w:type="spellEnd"/>
+            <w:r>
+              <w:t xml:space="preserve"> </w:t>
+            </w:r>
+            <w:proofErr w:type="spellStart"/>
+            <w:r>
+              <w:t>Github</w:t>
+            </w:r>
+            <w:proofErr w:type="spellEnd"/>
+            <w:r>
+              <w:t xml:space="preserve"> oldalakon lévő XSD fájlokban lévő </w:t>
+            </w:r>
+            <w:proofErr w:type="spellStart"/>
+            <w:r>
+              <w:t>namespace-ből</w:t>
+            </w:r>
+            <w:proofErr w:type="spellEnd"/>
+            <w:r>
+              <w:t xml:space="preserve"> kell venni az értéket.</w:t>
+            </w:r>
+            <w:r>
+              <w:br/>
+              <w:t xml:space="preserve">Ennek a verziószámnak egyeznie kell a beküldött </w:t>
+            </w:r>
+            <w:proofErr w:type="spellStart"/>
+            <w:r>
+              <w:t>xml</w:t>
+            </w:r>
+            <w:proofErr w:type="spellEnd"/>
+            <w:r>
+              <w:t xml:space="preserve"> </w:t>
+            </w:r>
+            <w:proofErr w:type="spellStart"/>
+            <w:r>
+              <w:t>namespace</w:t>
+            </w:r>
+            <w:proofErr w:type="spellEnd"/>
+            <w:r>
+              <w:t>-ben lévő bizonylat verzióval.</w:t>
+            </w:r>
+            <w:r>
+              <w:br/>
+              <w:t xml:space="preserve">Amennyiben nem egyezik az itt megadott érték a beküldött </w:t>
+            </w:r>
+            <w:proofErr w:type="spellStart"/>
+            <w:r>
+              <w:t>xml</w:t>
+            </w:r>
+            <w:proofErr w:type="spellEnd"/>
+            <w:r>
+              <w:t xml:space="preserve"> </w:t>
+            </w:r>
+            <w:proofErr w:type="spellStart"/>
+            <w:r>
+              <w:t>namespace</w:t>
+            </w:r>
+            <w:proofErr w:type="spellEnd"/>
+            <w:r>
+              <w:t>-ben lévővel, úgy a válaszban XSD validációs hiba fog visszaérkezni.</w:t>
             </w:r>
           </w:p>
         </w:tc>
@@ -18841,6 +19278,7 @@
           <w:bCs/>
           <w:u w:val="single"/>
         </w:rPr>
+        <w:lastRenderedPageBreak/>
         <w:t>Válasz:</w:t>
       </w:r>
     </w:p>
@@ -19638,7 +20076,6 @@
           <w:bCs/>
           <w:u w:val="single"/>
         </w:rPr>
-        <w:lastRenderedPageBreak/>
         <w:t>Válaszkódok:</w:t>
       </w:r>
       <w:r>
@@ -19839,6 +20276,7 @@
           </w:tcPr>
           <w:p>
             <w:r>
+              <w:lastRenderedPageBreak/>
               <w:t>VIRUSOS_FAJL</w:t>
             </w:r>
           </w:p>
@@ -20424,7 +20862,6 @@
           <w:sz w:val="24"/>
           <w:szCs w:val="24"/>
         </w:rPr>
-        <w:lastRenderedPageBreak/>
         <w:t>Bizonylat beküldés státusz lekérdezés művelet</w:t>
       </w:r>
       <w:bookmarkEnd w:id="30"/>
@@ -20602,6 +21039,7 @@
                 <w:b/>
                 <w:bCs/>
               </w:rPr>
+              <w:lastRenderedPageBreak/>
               <w:t>OpenAPI</w:t>
             </w:r>
             <w:proofErr w:type="spellEnd"/>
@@ -21474,7 +21912,6 @@
     </w:p>
     <w:p>
       <w:r>
-        <w:lastRenderedPageBreak/>
         <w:t xml:space="preserve">A </w:t>
       </w:r>
       <w:proofErr w:type="spellStart"/>
@@ -21630,6 +22067,7 @@
       </w:pPr>
       <w:bookmarkStart w:id="31" w:name="_Toc234087560"/>
       <w:r>
+        <w:lastRenderedPageBreak/>
         <w:t>SOAP interfész</w:t>
       </w:r>
       <w:bookmarkStart w:id="32" w:name="_Toc166508441"/>
@@ -22409,7 +22847,6 @@
                 <w:b/>
                 <w:bCs/>
               </w:rPr>
-              <w:lastRenderedPageBreak/>
               <w:t>név</w:t>
             </w:r>
           </w:p>
@@ -22595,6 +23032,7 @@
       <w:bookmarkStart w:id="38" w:name="_Toc234087564"/>
       <w:bookmarkStart w:id="39" w:name="_Toc166508449"/>
       <w:r>
+        <w:lastRenderedPageBreak/>
         <w:t>Bizonylatkezelés általános struktúrái</w:t>
       </w:r>
       <w:bookmarkEnd w:id="38"/>
@@ -27278,7 +27716,6 @@
   <w:style w:type="character" w:default="1" w:styleId="DefaultParagraphFont">
     <w:name w:val="Default Paragraph Font"/>
     <w:uiPriority w:val="1"/>
-    <w:semiHidden/>
     <w:unhideWhenUsed/>
   </w:style>
   <w:style w:type="table" w:default="1" w:styleId="TableNormal">
@@ -27976,6 +28413,12 @@
 </file>
 
 <file path=customXml/item1.xml><?xml version="1.0" encoding="utf-8"?>
+<p:properties xmlns:p="http://schemas.microsoft.com/office/2006/metadata/properties" xmlns:xsi="http://www.w3.org/2001/XMLSchema-instance" xmlns:pc="http://schemas.microsoft.com/office/infopath/2007/PartnerControls">
+  <documentManagement/>
+</p:properties>
+</file>
+
+<file path=customXml/item2.xml><?xml version="1.0" encoding="utf-8"?>
 <?mso-contentType ?>
 <FormTemplates xmlns="http://schemas.microsoft.com/sharepoint/v3/contenttype/forms">
   <Display>DocumentLibraryForm</Display>
@@ -27984,13 +28427,11 @@
 </FormTemplates>
 </file>
 
-<file path=customXml/item2.xml><?xml version="1.0" encoding="utf-8"?>
-<p:properties xmlns:p="http://schemas.microsoft.com/office/2006/metadata/properties" xmlns:xsi="http://www.w3.org/2001/XMLSchema-instance" xmlns:pc="http://schemas.microsoft.com/office/infopath/2007/PartnerControls">
-  <documentManagement/>
-</p:properties>
+<file path=customXml/item3.xml><?xml version="1.0" encoding="utf-8"?>
+<b:Sources xmlns:b="http://schemas.openxmlformats.org/officeDocument/2006/bibliography" xmlns="http://schemas.openxmlformats.org/officeDocument/2006/bibliography" SelectedStyle="\APASixthEditionOfficeOnline.xsl" StyleName="APA" Version="6"/>
 </file>
 
-<file path=customXml/item3.xml><?xml version="1.0" encoding="utf-8"?>
+<file path=customXml/item4.xml><?xml version="1.0" encoding="utf-8"?>
 <ct:contentTypeSchema xmlns:ct="http://schemas.microsoft.com/office/2006/metadata/contentType" xmlns:ma="http://schemas.microsoft.com/office/2006/metadata/properties/metaAttributes" ct:_="" ma:_="" ma:contentTypeName="Dokumentum" ma:contentTypeID="0x010100547A55C068818A43A8BB2703D743D8BE" ma:contentTypeVersion="0" ma:contentTypeDescription="Új dokumentum létrehozása." ma:contentTypeScope="" ma:versionID="677179708cd6a2061476446520c1c416">
   <xsd:schema xmlns:xsd="http://www.w3.org/2001/XMLSchema" xmlns:xs="http://www.w3.org/2001/XMLSchema" xmlns:p="http://schemas.microsoft.com/office/2006/metadata/properties" targetNamespace="http://schemas.microsoft.com/office/2006/metadata/properties" ma:root="true" ma:fieldsID="08dee037046ad32af3116d3be75d37a6">
     <xsd:element name="properties">
@@ -28104,19 +28545,7 @@
 </ct:contentTypeSchema>
 </file>
 
-<file path=customXml/item4.xml><?xml version="1.0" encoding="utf-8"?>
-<b:Sources xmlns:b="http://schemas.openxmlformats.org/officeDocument/2006/bibliography" xmlns="http://schemas.openxmlformats.org/officeDocument/2006/bibliography" SelectedStyle="\APASixthEditionOfficeOnline.xsl" StyleName="APA" Version="6"/>
-</file>
-
 <file path=customXml/itemProps1.xml><?xml version="1.0" encoding="utf-8"?>
-<ds:datastoreItem xmlns:ds="http://schemas.openxmlformats.org/officeDocument/2006/customXml" ds:itemID="{28923AFE-DC5A-4221-AE77-BD20F9C4CF75}">
-  <ds:schemaRefs>
-    <ds:schemaRef ds:uri="http://schemas.microsoft.com/sharepoint/v3/contenttype/forms"/>
-  </ds:schemaRefs>
-</ds:datastoreItem>
-</file>
-
-<file path=customXml/itemProps2.xml><?xml version="1.0" encoding="utf-8"?>
 <ds:datastoreItem xmlns:ds="http://schemas.openxmlformats.org/officeDocument/2006/customXml" ds:itemID="{BDE212CA-BC8E-45BB-9616-6296F64F802D}">
   <ds:schemaRefs>
     <ds:schemaRef ds:uri="http://schemas.microsoft.com/office/2006/metadata/properties"/>
@@ -28125,7 +28554,23 @@
 </ds:datastoreItem>
 </file>
 
+<file path=customXml/itemProps2.xml><?xml version="1.0" encoding="utf-8"?>
+<ds:datastoreItem xmlns:ds="http://schemas.openxmlformats.org/officeDocument/2006/customXml" ds:itemID="{28923AFE-DC5A-4221-AE77-BD20F9C4CF75}">
+  <ds:schemaRefs>
+    <ds:schemaRef ds:uri="http://schemas.microsoft.com/sharepoint/v3/contenttype/forms"/>
+  </ds:schemaRefs>
+</ds:datastoreItem>
+</file>
+
 <file path=customXml/itemProps3.xml><?xml version="1.0" encoding="utf-8"?>
+<ds:datastoreItem xmlns:ds="http://schemas.openxmlformats.org/officeDocument/2006/customXml" ds:itemID="{591D78F0-EE4D-4606-A14C-1D681FC99DBF}">
+  <ds:schemaRefs>
+    <ds:schemaRef ds:uri="http://schemas.openxmlformats.org/officeDocument/2006/bibliography"/>
+  </ds:schemaRefs>
+</ds:datastoreItem>
+</file>
+
+<file path=customXml/itemProps4.xml><?xml version="1.0" encoding="utf-8"?>
 <ds:datastoreItem xmlns:ds="http://schemas.openxmlformats.org/officeDocument/2006/customXml" ds:itemID="{5DBE1F02-EA77-40BD-91B2-6714162069BC}">
   <ds:schemaRefs>
     <ds:schemaRef ds:uri="http://schemas.microsoft.com/office/2006/metadata/contentType"/>
@@ -28139,12 +28584,4 @@
     <ds:schemaRef ds:uri="http://schemas.microsoft.com/office/infopath/2007/PartnerControls"/>
   </ds:schemaRefs>
 </ds:datastoreItem>
-</file>
-
-<file path=customXml/itemProps4.xml><?xml version="1.0" encoding="utf-8"?>
-<ds:datastoreItem xmlns:ds="http://schemas.openxmlformats.org/officeDocument/2006/customXml" ds:itemID="{591D78F0-EE4D-4606-A14C-1D681FC99DBF}">
-  <ds:schemaRefs>
-    <ds:schemaRef ds:uri="http://schemas.openxmlformats.org/officeDocument/2006/bibliography"/>
-  </ds:schemaRefs>
-</ds:datastoreItem>
 </file>
</xml_diff>

<commit_message>
linkek javítása, kliens idő ellenőrzés
</commit_message>
<xml_diff>
--- a/docs/spec/M2M új bizonylat interfész specifikáció 1.0.docx
+++ b/docs/spec/M2M új bizonylat interfész specifikáció 1.0.docx
@@ -9094,12 +9094,24 @@
             <w:shd w:val="clear" w:color="auto" w:fill="D9D9D9" w:themeFill="background1" w:themeFillShade="D9"/>
           </w:tcPr>
           <w:p>
-            <w:hyperlink r:id="rId17" w:history="1">
+            <w:hyperlink r:id="rId17" w:anchor="/BizonylatService" w:history="1">
               <w:r>
                 <w:rPr>
                   <w:rStyle w:val="Hyperlink"/>
                 </w:rPr>
-                <w:t>https://app.swaggerhub.com/apis/NAVGOVHU/NavM2mBizonylat/1.0#/BizonylatService</w:t>
+                <w:t>https://app.swaggerhub.com/apis/NAVGO</w:t>
+              </w:r>
+              <w:r>
+                <w:rPr>
+                  <w:rStyle w:val="Hyperlink"/>
+                </w:rPr>
+                <w:t>V</w:t>
+              </w:r>
+              <w:r>
+                <w:rPr>
+                  <w:rStyle w:val="Hyperlink"/>
+                </w:rPr>
+                <w:t>HU/NavM2mBizonylat/1.0#/BizonylatService</w:t>
               </w:r>
             </w:hyperlink>
           </w:p>
@@ -9388,12 +9400,24 @@
                 <w:highlight w:val="yellow"/>
               </w:rPr>
             </w:pPr>
-            <w:hyperlink r:id="rId18" w:history="1">
+            <w:hyperlink r:id="rId18" w:anchor="/BizonylatService/createKalkulacio" w:history="1">
               <w:r>
                 <w:rPr>
                   <w:rStyle w:val="Hyperlink"/>
                 </w:rPr>
-                <w:t>https://app.swaggerhub.com/apis/NAVGOVHU/NavM2mBizonylat/1.0#/BizonylatService/createKalkulacio</w:t>
+                <w:t>https://app.swaggerhub.com/a</w:t>
+              </w:r>
+              <w:r>
+                <w:rPr>
+                  <w:rStyle w:val="Hyperlink"/>
+                </w:rPr>
+                <w:t>p</w:t>
+              </w:r>
+              <w:r>
+                <w:rPr>
+                  <w:rStyle w:val="Hyperlink"/>
+                </w:rPr>
+                <w:t>is/NAVGOVHU/NavM2mBizonylat/1.0#/BizonylatService/createKalkulacio</w:t>
               </w:r>
             </w:hyperlink>
           </w:p>
@@ -12480,12 +12504,24 @@
             <w:shd w:val="clear" w:color="auto" w:fill="D9D9D9" w:themeFill="background1" w:themeFillShade="D9"/>
           </w:tcPr>
           <w:p>
-            <w:hyperlink r:id="rId19" w:history="1">
+            <w:hyperlink r:id="rId19" w:anchor="/BizonylatService/getKalkulacio" w:history="1">
               <w:r>
                 <w:rPr>
                   <w:rStyle w:val="Hyperlink"/>
                 </w:rPr>
-                <w:t>https://app.swaggerhub.com/apis/NAVGOVHU/NavM2mBizonylat/1.0#/BizonylatService/getKalkulacio</w:t>
+                <w:t>https://app.swaggerhub.co</w:t>
+              </w:r>
+              <w:r>
+                <w:rPr>
+                  <w:rStyle w:val="Hyperlink"/>
+                </w:rPr>
+                <w:t>m</w:t>
+              </w:r>
+              <w:r>
+                <w:rPr>
+                  <w:rStyle w:val="Hyperlink"/>
+                </w:rPr>
+                <w:t>/apis/NAVGOVHU/NavM2mBizonylat/1.0#/BizonylatService/getKalkulacio</w:t>
               </w:r>
             </w:hyperlink>
           </w:p>
@@ -13641,7 +13677,7 @@
                 <w:highlight w:val="yellow"/>
               </w:rPr>
             </w:pPr>
-            <w:hyperlink r:id="rId20" w:history="1">
+            <w:hyperlink r:id="rId20" w:anchor="/BizonylatService/createValidacio" w:history="1">
               <w:r>
                 <w:rPr>
                   <w:rStyle w:val="Hyperlink"/>
@@ -16499,7 +16535,7 @@
             <w:shd w:val="clear" w:color="auto" w:fill="D9D9D9" w:themeFill="background1" w:themeFillShade="D9"/>
           </w:tcPr>
           <w:p>
-            <w:hyperlink r:id="rId21" w:history="1">
+            <w:hyperlink r:id="rId21" w:anchor="/BizonylatService/getValidacio" w:history="1">
               <w:r>
                 <w:rPr>
                   <w:rStyle w:val="Hyperlink"/>
@@ -17697,7 +17733,7 @@
                 <w:highlight w:val="yellow"/>
               </w:rPr>
             </w:pPr>
-            <w:hyperlink r:id="rId22" w:history="1">
+            <w:hyperlink r:id="rId22" w:anchor="/BizonylatService/createBizonylat" w:history="1">
               <w:r>
                 <w:rPr>
                   <w:rStyle w:val="Hyperlink"/>
@@ -21051,12 +21087,24 @@
             <w:shd w:val="clear" w:color="auto" w:fill="D9D9D9" w:themeFill="background1" w:themeFillShade="D9"/>
           </w:tcPr>
           <w:p>
-            <w:hyperlink r:id="rId23" w:history="1">
+            <w:hyperlink r:id="rId23" w:anchor="/BizonylatService/getBizonylat" w:history="1">
               <w:r>
                 <w:rPr>
                   <w:rStyle w:val="Hyperlink"/>
                 </w:rPr>
-                <w:t>https://app.swaggerhub.com/apis/NAVGOVHU/NavM2mBizonylat/1.0#/BizonylatService/getBizonylat</w:t>
+                <w:t>https://app.swaggerhub.com/apis/NAVG</w:t>
+              </w:r>
+              <w:r>
+                <w:rPr>
+                  <w:rStyle w:val="Hyperlink"/>
+                </w:rPr>
+                <w:t>O</w:t>
+              </w:r>
+              <w:r>
+                <w:rPr>
+                  <w:rStyle w:val="Hyperlink"/>
+                </w:rPr>
+                <w:t>VHU/NavM2mBizonylat/1.0#/BizonylatService/getBizonylat</w:t>
               </w:r>
             </w:hyperlink>
           </w:p>
@@ -27716,6 +27764,7 @@
   <w:style w:type="character" w:default="1" w:styleId="DefaultParagraphFont">
     <w:name w:val="Default Paragraph Font"/>
     <w:uiPriority w:val="1"/>
+    <w:semiHidden/>
     <w:unhideWhenUsed/>
   </w:style>
   <w:style w:type="table" w:default="1" w:styleId="TableNormal">
@@ -28413,12 +28462,6 @@
 </file>
 
 <file path=customXml/item1.xml><?xml version="1.0" encoding="utf-8"?>
-<p:properties xmlns:p="http://schemas.microsoft.com/office/2006/metadata/properties" xmlns:xsi="http://www.w3.org/2001/XMLSchema-instance" xmlns:pc="http://schemas.microsoft.com/office/infopath/2007/PartnerControls">
-  <documentManagement/>
-</p:properties>
-</file>
-
-<file path=customXml/item2.xml><?xml version="1.0" encoding="utf-8"?>
 <?mso-contentType ?>
 <FormTemplates xmlns="http://schemas.microsoft.com/sharepoint/v3/contenttype/forms">
   <Display>DocumentLibraryForm</Display>
@@ -28427,11 +28470,13 @@
 </FormTemplates>
 </file>
 
-<file path=customXml/item3.xml><?xml version="1.0" encoding="utf-8"?>
-<b:Sources xmlns:b="http://schemas.openxmlformats.org/officeDocument/2006/bibliography" xmlns="http://schemas.openxmlformats.org/officeDocument/2006/bibliography" SelectedStyle="\APASixthEditionOfficeOnline.xsl" StyleName="APA" Version="6"/>
+<file path=customXml/item2.xml><?xml version="1.0" encoding="utf-8"?>
+<p:properties xmlns:p="http://schemas.microsoft.com/office/2006/metadata/properties" xmlns:xsi="http://www.w3.org/2001/XMLSchema-instance" xmlns:pc="http://schemas.microsoft.com/office/infopath/2007/PartnerControls">
+  <documentManagement/>
+</p:properties>
 </file>
 
-<file path=customXml/item4.xml><?xml version="1.0" encoding="utf-8"?>
+<file path=customXml/item3.xml><?xml version="1.0" encoding="utf-8"?>
 <ct:contentTypeSchema xmlns:ct="http://schemas.microsoft.com/office/2006/metadata/contentType" xmlns:ma="http://schemas.microsoft.com/office/2006/metadata/properties/metaAttributes" ct:_="" ma:_="" ma:contentTypeName="Dokumentum" ma:contentTypeID="0x010100547A55C068818A43A8BB2703D743D8BE" ma:contentTypeVersion="0" ma:contentTypeDescription="Új dokumentum létrehozása." ma:contentTypeScope="" ma:versionID="677179708cd6a2061476446520c1c416">
   <xsd:schema xmlns:xsd="http://www.w3.org/2001/XMLSchema" xmlns:xs="http://www.w3.org/2001/XMLSchema" xmlns:p="http://schemas.microsoft.com/office/2006/metadata/properties" targetNamespace="http://schemas.microsoft.com/office/2006/metadata/properties" ma:root="true" ma:fieldsID="08dee037046ad32af3116d3be75d37a6">
     <xsd:element name="properties">
@@ -28545,7 +28590,19 @@
 </ct:contentTypeSchema>
 </file>
 
+<file path=customXml/item4.xml><?xml version="1.0" encoding="utf-8"?>
+<b:Sources xmlns:b="http://schemas.openxmlformats.org/officeDocument/2006/bibliography" xmlns="http://schemas.openxmlformats.org/officeDocument/2006/bibliography" SelectedStyle="\APASixthEditionOfficeOnline.xsl" StyleName="APA" Version="6"/>
+</file>
+
 <file path=customXml/itemProps1.xml><?xml version="1.0" encoding="utf-8"?>
+<ds:datastoreItem xmlns:ds="http://schemas.openxmlformats.org/officeDocument/2006/customXml" ds:itemID="{28923AFE-DC5A-4221-AE77-BD20F9C4CF75}">
+  <ds:schemaRefs>
+    <ds:schemaRef ds:uri="http://schemas.microsoft.com/sharepoint/v3/contenttype/forms"/>
+  </ds:schemaRefs>
+</ds:datastoreItem>
+</file>
+
+<file path=customXml/itemProps2.xml><?xml version="1.0" encoding="utf-8"?>
 <ds:datastoreItem xmlns:ds="http://schemas.openxmlformats.org/officeDocument/2006/customXml" ds:itemID="{BDE212CA-BC8E-45BB-9616-6296F64F802D}">
   <ds:schemaRefs>
     <ds:schemaRef ds:uri="http://schemas.microsoft.com/office/2006/metadata/properties"/>
@@ -28554,23 +28611,7 @@
 </ds:datastoreItem>
 </file>
 
-<file path=customXml/itemProps2.xml><?xml version="1.0" encoding="utf-8"?>
-<ds:datastoreItem xmlns:ds="http://schemas.openxmlformats.org/officeDocument/2006/customXml" ds:itemID="{28923AFE-DC5A-4221-AE77-BD20F9C4CF75}">
-  <ds:schemaRefs>
-    <ds:schemaRef ds:uri="http://schemas.microsoft.com/sharepoint/v3/contenttype/forms"/>
-  </ds:schemaRefs>
-</ds:datastoreItem>
-</file>
-
 <file path=customXml/itemProps3.xml><?xml version="1.0" encoding="utf-8"?>
-<ds:datastoreItem xmlns:ds="http://schemas.openxmlformats.org/officeDocument/2006/customXml" ds:itemID="{591D78F0-EE4D-4606-A14C-1D681FC99DBF}">
-  <ds:schemaRefs>
-    <ds:schemaRef ds:uri="http://schemas.openxmlformats.org/officeDocument/2006/bibliography"/>
-  </ds:schemaRefs>
-</ds:datastoreItem>
-</file>
-
-<file path=customXml/itemProps4.xml><?xml version="1.0" encoding="utf-8"?>
 <ds:datastoreItem xmlns:ds="http://schemas.openxmlformats.org/officeDocument/2006/customXml" ds:itemID="{5DBE1F02-EA77-40BD-91B2-6714162069BC}">
   <ds:schemaRefs>
     <ds:schemaRef ds:uri="http://schemas.microsoft.com/office/2006/metadata/contentType"/>
@@ -28584,4 +28625,12 @@
     <ds:schemaRef ds:uri="http://schemas.microsoft.com/office/infopath/2007/PartnerControls"/>
   </ds:schemaRefs>
 </ds:datastoreItem>
+</file>
+
+<file path=customXml/itemProps4.xml><?xml version="1.0" encoding="utf-8"?>
+<ds:datastoreItem xmlns:ds="http://schemas.openxmlformats.org/officeDocument/2006/customXml" ds:itemID="{591D78F0-EE4D-4606-A14C-1D681FC99DBF}">
+  <ds:schemaRefs>
+    <ds:schemaRef ds:uri="http://schemas.openxmlformats.org/officeDocument/2006/bibliography"/>
+  </ds:schemaRefs>
+</ds:datastoreItem>
 </file>
</xml_diff>